<commit_message>
fix: update template file
</commit_message>
<xml_diff>
--- a/PopPK_Report_merge_TFL_filled_draft.docx
+++ b/PopPK_Report_merge_TFL_filled_draft.docx
@@ -95,9 +95,11 @@
             <w:pPr>
               <w:pStyle w:val="Z-LineR1"/>
             </w:pPr>
+            <w:proofErr w:type="spellStart"/>
             <w:r>
               <w:t>hhh</w:t>
             </w:r>
+            <w:proofErr w:type="spellEnd"/>
           </w:p>
         </w:tc>
       </w:tr>
@@ -144,9 +146,11 @@
             <w:pPr>
               <w:pStyle w:val="Z-LineR2"/>
             </w:pPr>
+            <w:proofErr w:type="spellStart"/>
             <w:r>
               <w:t>jjj</w:t>
             </w:r>
+            <w:proofErr w:type="spellEnd"/>
           </w:p>
         </w:tc>
       </w:tr>
@@ -187,9 +191,11 @@
             <w:pPr>
               <w:pStyle w:val="Z-LineR3"/>
             </w:pPr>
+            <w:proofErr w:type="spellStart"/>
             <w:r>
               <w:t>jjj</w:t>
             </w:r>
+            <w:proofErr w:type="spellEnd"/>
           </w:p>
         </w:tc>
       </w:tr>
@@ -230,9 +236,11 @@
             <w:pPr>
               <w:pStyle w:val="Z-LineR4"/>
             </w:pPr>
+            <w:proofErr w:type="spellStart"/>
             <w:r>
               <w:t>jkjkhjk</w:t>
             </w:r>
+            <w:proofErr w:type="spellEnd"/>
           </w:p>
         </w:tc>
       </w:tr>
@@ -692,15 +700,16 @@
                 <w:sz w:val="22"/>
                 <w:szCs w:val="22"/>
               </w:rPr>
-              <w:t xml:space="preserve"> a previously developed model with new data (such as a Phase 3 update), use the template PopPK_</w:t>
-            </w:r>
+              <w:t xml:space="preserve"> a previously developed model with new data (such as a Phase 3 update), use the template </w:t>
+            </w:r>
+            <w:proofErr w:type="spellStart"/>
             <w:r>
               <w:rPr>
                 <w:rFonts w:ascii="Times New Roman" w:hAnsi="Times New Roman"/>
                 <w:sz w:val="22"/>
                 <w:szCs w:val="22"/>
               </w:rPr>
-              <w:t>ModelReport</w:t>
+              <w:t>PopPK_</w:t>
             </w:r>
             <w:r>
               <w:rPr>
@@ -708,8 +717,17 @@
                 <w:sz w:val="22"/>
                 <w:szCs w:val="22"/>
               </w:rPr>
+              <w:t>ModelReport</w:t>
+            </w:r>
+            <w:r>
+              <w:rPr>
+                <w:rFonts w:ascii="Times New Roman" w:hAnsi="Times New Roman"/>
+                <w:sz w:val="22"/>
+                <w:szCs w:val="22"/>
+              </w:rPr>
               <w:t>_ModelUpdate</w:t>
             </w:r>
+            <w:proofErr w:type="spellEnd"/>
           </w:p>
           <w:p>
             <w:pPr>
@@ -975,7 +993,15 @@
               <w:t>should not be modified unless strictly necessary</w:t>
             </w:r>
             <w:r>
-              <w:t xml:space="preserve"> since they have corresponding sections in the templated analysis report and the TFLs are pre-coded within the MERGE popPK activity templates.</w:t>
+              <w:t xml:space="preserve"> since they have corresponding sections in the templated analysis report and the TFLs are pre-coded within the MERGE </w:t>
+            </w:r>
+            <w:proofErr w:type="spellStart"/>
+            <w:r>
+              <w:t>popPK</w:t>
+            </w:r>
+            <w:proofErr w:type="spellEnd"/>
+            <w:r>
+              <w:t xml:space="preserve"> activity templates.</w:t>
             </w:r>
           </w:p>
           <w:p>
@@ -992,7 +1018,23 @@
                 <w:sz w:val="24"/>
                 <w:szCs w:val="24"/>
               </w:rPr>
-              <w:t>Where several options are provided, please choose which one to use and delete the other version. The option-specific text refers to the one paragraph including the [Option x: ]. Subsequent paragraphs below/above the option should be kept, irrespectively of which option you choose.</w:t>
+              <w:t>Where several options are provided, please choose which one to use and delete the other version. The option-specific text refers to the one paragraph including the [Option x</w:t>
+            </w:r>
+            <w:proofErr w:type="gramStart"/>
+            <w:r>
+              <w:rPr>
+                <w:sz w:val="24"/>
+                <w:szCs w:val="24"/>
+              </w:rPr>
+              <w:t>: ]</w:t>
+            </w:r>
+            <w:proofErr w:type="gramEnd"/>
+            <w:r>
+              <w:rPr>
+                <w:sz w:val="24"/>
+                <w:szCs w:val="24"/>
+              </w:rPr>
+              <w:t>. Subsequent paragraphs below/above the option should be kept, irrespectively of which option you choose.</w:t>
             </w:r>
           </w:p>
         </w:tc>
@@ -1076,7 +1118,25 @@
                 <w:szCs w:val="22"/>
                 <w:lang w:val="en-US"/>
               </w:rPr>
-              <w:t>Refresh all ToCs before finalization.</w:t>
+              <w:t xml:space="preserve">Refresh all </w:t>
+            </w:r>
+            <w:proofErr w:type="spellStart"/>
+            <w:r>
+              <w:rPr>
+                <w:sz w:val="22"/>
+                <w:szCs w:val="22"/>
+                <w:lang w:val="en-US"/>
+              </w:rPr>
+              <w:t>ToCs</w:t>
+            </w:r>
+            <w:proofErr w:type="spellEnd"/>
+            <w:r>
+              <w:rPr>
+                <w:sz w:val="22"/>
+                <w:szCs w:val="22"/>
+                <w:lang w:val="en-US"/>
+              </w:rPr>
+              <w:t xml:space="preserve"> before finalization.</w:t>
             </w:r>
           </w:p>
           <w:p>
@@ -4974,7 +5034,23 @@
             <w:lang w:val="en-US"/>
           </w:rPr>
           <w:tab/>
-          <w:t>Summary of Studies Included in the Population PK Analysis</w:t>
+          <w:t>Summary of Studie</w:t>
+        </w:r>
+        <w:r>
+          <w:rPr>
+            <w:rStyle w:val="Hyperlink"/>
+            <w:noProof/>
+            <w:lang w:val="en-US"/>
+          </w:rPr>
+          <w:t>s</w:t>
+        </w:r>
+        <w:r>
+          <w:rPr>
+            <w:rStyle w:val="Hyperlink"/>
+            <w:noProof/>
+            <w:lang w:val="en-US"/>
+          </w:rPr>
+          <w:t xml:space="preserve"> Included in the Population PK Analysis</w:t>
         </w:r>
         <w:r>
           <w:rPr>
@@ -5098,72 +5174,98 @@
           <w14:ligatures w14:val="standardContextual"/>
         </w:rPr>
       </w:pPr>
-      <w:hyperlink w:anchor="_Toc224140105" w:history="1">
-        <w:r>
-          <w:rPr>
-            <w:rStyle w:val="Hyperlink"/>
-            <w:noProof/>
-          </w:rPr>
-          <w:t>Table 3</w:t>
-        </w:r>
-        <w:r>
-          <w:rPr>
-            <w:rStyle w:val="Hyperlink"/>
-            <w:noProof/>
-          </w:rPr>
-          <w:tab/>
-          <w:t xml:space="preserve">Summary of Covariates Overall and by </w:t>
-        </w:r>
-        <w:r>
-          <w:rPr>
-            <w:rStyle w:val="Hyperlink"/>
-            <w:noProof/>
-            <w:highlight w:val="cyan"/>
-          </w:rPr>
-          <w:t>{{Study}}</w:t>
-        </w:r>
-        <w:r>
-          <w:rPr>
-            <w:noProof/>
-          </w:rPr>
-          <w:tab/>
-        </w:r>
-        <w:r>
-          <w:rPr>
-            <w:noProof/>
-          </w:rPr>
-          <w:fldChar w:fldCharType="begin"/>
-        </w:r>
-        <w:r>
-          <w:rPr>
-            <w:noProof/>
-          </w:rPr>
-          <w:instrText xml:space="preserve"> PAGEREF _Toc224140105 \h </w:instrText>
-        </w:r>
-        <w:r>
-          <w:rPr>
-            <w:noProof/>
-          </w:rPr>
-        </w:r>
-        <w:r>
-          <w:rPr>
-            <w:noProof/>
-          </w:rPr>
-          <w:fldChar w:fldCharType="separate"/>
-        </w:r>
-        <w:r>
-          <w:rPr>
-            <w:noProof/>
-          </w:rPr>
-          <w:t>20</w:t>
-        </w:r>
-        <w:r>
-          <w:rPr>
-            <w:noProof/>
-          </w:rPr>
-          <w:fldChar w:fldCharType="end"/>
-        </w:r>
-      </w:hyperlink>
+      <w:r>
+        <w:fldChar w:fldCharType="begin"/>
+      </w:r>
+      <w:r>
+        <w:instrText>HYPERLINK \l "_Toc224140105"</w:instrText>
+      </w:r>
+      <w:r>
+        <w:fldChar w:fldCharType="separate"/>
+      </w:r>
+      <w:r>
+        <w:rPr>
+          <w:rStyle w:val="Hyperlink"/>
+          <w:noProof/>
+        </w:rPr>
+        <w:t>Table 3</w:t>
+      </w:r>
+      <w:r>
+        <w:rPr>
+          <w:rStyle w:val="Hyperlink"/>
+          <w:noProof/>
+        </w:rPr>
+        <w:tab/>
+        <w:t xml:space="preserve">Summary of Covariates Overall and by </w:t>
+      </w:r>
+      <w:r>
+        <w:rPr>
+          <w:rStyle w:val="Hyperlink"/>
+          <w:noProof/>
+          <w:highlight w:val="cyan"/>
+        </w:rPr>
+        <w:t>{{S</w:t>
+      </w:r>
+      <w:r>
+        <w:rPr>
+          <w:rStyle w:val="Hyperlink"/>
+          <w:noProof/>
+          <w:highlight w:val="cyan"/>
+        </w:rPr>
+        <w:t>}</w:t>
+      </w:r>
+      <w:r>
+        <w:rPr>
+          <w:rStyle w:val="Hyperlink"/>
+          <w:noProof/>
+          <w:highlight w:val="cyan"/>
+        </w:rPr>
+        <w:t>}</w:t>
+      </w:r>
+      <w:r>
+        <w:rPr>
+          <w:noProof/>
+        </w:rPr>
+        <w:tab/>
+      </w:r>
+      <w:r>
+        <w:rPr>
+          <w:noProof/>
+        </w:rPr>
+        <w:fldChar w:fldCharType="begin"/>
+      </w:r>
+      <w:r>
+        <w:rPr>
+          <w:noProof/>
+        </w:rPr>
+        <w:instrText xml:space="preserve"> PAGEREF _Toc224140105 \h </w:instrText>
+      </w:r>
+      <w:r>
+        <w:rPr>
+          <w:noProof/>
+        </w:rPr>
+      </w:r>
+      <w:r>
+        <w:rPr>
+          <w:noProof/>
+        </w:rPr>
+        <w:fldChar w:fldCharType="separate"/>
+      </w:r>
+      <w:r>
+        <w:rPr>
+          <w:noProof/>
+        </w:rPr>
+        <w:t>20</w:t>
+      </w:r>
+      <w:r>
+        <w:rPr>
+          <w:noProof/>
+        </w:rPr>
+        <w:fldChar w:fldCharType="end"/>
+      </w:r>
+      <w:r>
+        <w:fldChar w:fldCharType="end"/>
+      </w:r>
     </w:p>
     <w:p>
       <w:pPr>
@@ -5464,6 +5566,7 @@
           <w:rFonts w:eastAsiaTheme="minorEastAsia" w:cstheme="minorBidi"/>
           <w:noProof/>
           <w:kern w:val="2"/>
+          <w:lang w:val="en-IN" w:eastAsia="en-GB"/>
           <w14:ligatures w14:val="standardContextual"/>
         </w:rPr>
       </w:pPr>
@@ -5476,7 +5579,7 @@
       <w:r>
         <w:fldChar w:fldCharType="separate"/>
       </w:r>
-      <w:hyperlink w:anchor="_Toc224140110" w:history="1">
+      <w:hyperlink w:anchor="_Toc225770145" w:history="1">
         <w:r>
           <w:rPr>
             <w:rStyle w:val="Hyperlink"/>
@@ -5508,7 +5611,7 @@
           <w:rPr>
             <w:noProof/>
           </w:rPr>
-          <w:instrText xml:space="preserve"> PAGEREF _Toc224140110 \h </w:instrText>
+          <w:instrText xml:space="preserve"> PAGEREF _Toc225770145 \h </w:instrText>
         </w:r>
         <w:r>
           <w:rPr>
@@ -5525,7 +5628,7 @@
           <w:rPr>
             <w:noProof/>
           </w:rPr>
-          <w:t>21</w:t>
+          <w:t>20</w:t>
         </w:r>
         <w:r>
           <w:rPr>
@@ -5542,16 +5645,17 @@
           <w:rFonts w:eastAsiaTheme="minorEastAsia" w:cstheme="minorBidi"/>
           <w:noProof/>
           <w:kern w:val="2"/>
+          <w:lang w:val="en-IN" w:eastAsia="en-GB"/>
           <w14:ligatures w14:val="standardContextual"/>
         </w:rPr>
       </w:pPr>
-      <w:hyperlink w:anchor="_Toc224140111" w:history="1">
+      <w:hyperlink w:anchor="_Toc225770146" w:history="1">
         <w:r>
           <w:rPr>
             <w:rStyle w:val="Hyperlink"/>
             <w:noProof/>
           </w:rPr>
-          <w:t>Figure 2</w:t>
+          <w:t>Figure 3</w:t>
         </w:r>
         <w:r>
           <w:rPr>
@@ -5559,7 +5663,7 @@
             <w:noProof/>
           </w:rPr>
           <w:tab/>
-          <w:t>Correlation between Continuous Covariates and Sex</w:t>
+          <w:t>Correlation between Continuous Covariates and Renal Function</w:t>
         </w:r>
         <w:r>
           <w:rPr>
@@ -5577,7 +5681,7 @@
           <w:rPr>
             <w:noProof/>
           </w:rPr>
-          <w:instrText xml:space="preserve"> PAGEREF _Toc224140111 \h </w:instrText>
+          <w:instrText xml:space="preserve"> PAGEREF _Toc225770146 \h </w:instrText>
         </w:r>
         <w:r>
           <w:rPr>
@@ -5594,7 +5698,7 @@
           <w:rPr>
             <w:noProof/>
           </w:rPr>
-          <w:t>22</w:t>
+          <w:t>21</w:t>
         </w:r>
         <w:r>
           <w:rPr>
@@ -5611,16 +5715,17 @@
           <w:rFonts w:eastAsiaTheme="minorEastAsia" w:cstheme="minorBidi"/>
           <w:noProof/>
           <w:kern w:val="2"/>
+          <w:lang w:val="en-IN" w:eastAsia="en-GB"/>
           <w14:ligatures w14:val="standardContextual"/>
         </w:rPr>
       </w:pPr>
-      <w:hyperlink w:anchor="_Toc224140112" w:history="1">
+      <w:hyperlink w:anchor="_Toc225770147" w:history="1">
         <w:r>
           <w:rPr>
             <w:rStyle w:val="Hyperlink"/>
             <w:noProof/>
           </w:rPr>
-          <w:t>Figure 3</w:t>
+          <w:t>Figure 4</w:t>
         </w:r>
         <w:r>
           <w:rPr>
@@ -5628,7 +5733,7 @@
             <w:noProof/>
           </w:rPr>
           <w:tab/>
-          <w:t>Correlation between Continuous Covariates and Renal Function</w:t>
+          <w:t>Distributions and Correlations of Categorical Covariates</w:t>
         </w:r>
         <w:r>
           <w:rPr>
@@ -5646,7 +5751,7 @@
           <w:rPr>
             <w:noProof/>
           </w:rPr>
-          <w:instrText xml:space="preserve"> PAGEREF _Toc224140112 \h </w:instrText>
+          <w:instrText xml:space="preserve"> PAGEREF _Toc225770147 \h </w:instrText>
         </w:r>
         <w:r>
           <w:rPr>
@@ -5663,7 +5768,7 @@
           <w:rPr>
             <w:noProof/>
           </w:rPr>
-          <w:t>23</w:t>
+          <w:t>22</w:t>
         </w:r>
         <w:r>
           <w:rPr>
@@ -5680,16 +5785,17 @@
           <w:rFonts w:eastAsiaTheme="minorEastAsia" w:cstheme="minorBidi"/>
           <w:noProof/>
           <w:kern w:val="2"/>
+          <w:lang w:val="en-IN" w:eastAsia="en-GB"/>
           <w14:ligatures w14:val="standardContextual"/>
         </w:rPr>
       </w:pPr>
-      <w:hyperlink w:anchor="_Toc224140113" w:history="1">
+      <w:hyperlink w:anchor="_Toc225770148" w:history="1">
         <w:r>
           <w:rPr>
             <w:rStyle w:val="Hyperlink"/>
             <w:noProof/>
           </w:rPr>
-          <w:t>Figure 4</w:t>
+          <w:t>Figure 6</w:t>
         </w:r>
         <w:r>
           <w:rPr>
@@ -5697,7 +5803,7 @@
             <w:noProof/>
           </w:rPr>
           <w:tab/>
-          <w:t>Distributions and Correlations of Categorical Covariates</w:t>
+          <w:t>Concentrations versus Time after Dose by {{Study and Dose}} (log scale)</w:t>
         </w:r>
         <w:r>
           <w:rPr>
@@ -5715,7 +5821,7 @@
           <w:rPr>
             <w:noProof/>
           </w:rPr>
-          <w:instrText xml:space="preserve"> PAGEREF _Toc224140113 \h </w:instrText>
+          <w:instrText xml:space="preserve"> PAGEREF _Toc225770148 \h </w:instrText>
         </w:r>
         <w:r>
           <w:rPr>
@@ -5732,2466 +5838,7 @@
           <w:rPr>
             <w:noProof/>
           </w:rPr>
-          <w:t>24</w:t>
-        </w:r>
-        <w:r>
-          <w:rPr>
-            <w:noProof/>
-          </w:rPr>
-          <w:fldChar w:fldCharType="end"/>
-        </w:r>
-      </w:hyperlink>
-    </w:p>
-    <w:p>
-      <w:pPr>
-        <w:pStyle w:val="TableofFigures"/>
-        <w:rPr>
-          <w:rFonts w:eastAsiaTheme="minorEastAsia" w:cstheme="minorBidi"/>
-          <w:noProof/>
-          <w:kern w:val="2"/>
-          <w14:ligatures w14:val="standardContextual"/>
-        </w:rPr>
-      </w:pPr>
-      <w:hyperlink w:anchor="_Toc224140114" w:history="1">
-        <w:r>
-          <w:rPr>
-            <w:rStyle w:val="Hyperlink"/>
-            <w:noProof/>
-          </w:rPr>
-          <w:t>Figure 5</w:t>
-        </w:r>
-        <w:r>
-          <w:rPr>
-            <w:rStyle w:val="Hyperlink"/>
-            <w:noProof/>
-          </w:rPr>
-          <w:tab/>
-          <w:t xml:space="preserve">Concentrations versus Time by </w:t>
-        </w:r>
-        <w:r>
-          <w:rPr>
-            <w:rStyle w:val="Hyperlink"/>
-            <w:noProof/>
-            <w:highlight w:val="cyan"/>
-          </w:rPr>
-          <w:t>&lt;Study and Dose&gt;&gt;</w:t>
-        </w:r>
-        <w:r>
-          <w:rPr>
-            <w:rStyle w:val="Hyperlink"/>
-            <w:noProof/>
-          </w:rPr>
-          <w:t xml:space="preserve"> (log scale)</w:t>
-        </w:r>
-        <w:r>
-          <w:rPr>
-            <w:noProof/>
-          </w:rPr>
-          <w:tab/>
-        </w:r>
-        <w:r>
-          <w:rPr>
-            <w:noProof/>
-          </w:rPr>
-          <w:fldChar w:fldCharType="begin"/>
-        </w:r>
-        <w:r>
-          <w:rPr>
-            <w:noProof/>
-          </w:rPr>
-          <w:instrText xml:space="preserve"> PAGEREF _Toc224140114 \h </w:instrText>
-        </w:r>
-        <w:r>
-          <w:rPr>
-            <w:noProof/>
-          </w:rPr>
-        </w:r>
-        <w:r>
-          <w:rPr>
-            <w:noProof/>
-          </w:rPr>
-          <w:fldChar w:fldCharType="separate"/>
-        </w:r>
-        <w:r>
-          <w:rPr>
-            <w:noProof/>
-          </w:rPr>
-          <w:t>25</w:t>
-        </w:r>
-        <w:r>
-          <w:rPr>
-            <w:noProof/>
-          </w:rPr>
-          <w:fldChar w:fldCharType="end"/>
-        </w:r>
-      </w:hyperlink>
-    </w:p>
-    <w:p>
-      <w:pPr>
-        <w:pStyle w:val="TableofFigures"/>
-        <w:rPr>
-          <w:rFonts w:eastAsiaTheme="minorEastAsia" w:cstheme="minorBidi"/>
-          <w:noProof/>
-          <w:kern w:val="2"/>
-          <w14:ligatures w14:val="standardContextual"/>
-        </w:rPr>
-      </w:pPr>
-      <w:hyperlink w:anchor="_Toc224140115" w:history="1">
-        <w:r>
-          <w:rPr>
-            <w:rStyle w:val="Hyperlink"/>
-            <w:noProof/>
-          </w:rPr>
-          <w:t>Figure 6</w:t>
-        </w:r>
-        <w:r>
-          <w:rPr>
-            <w:rStyle w:val="Hyperlink"/>
-            <w:noProof/>
-          </w:rPr>
-          <w:tab/>
-          <w:t xml:space="preserve">Concentrations versus Time after Dose by </w:t>
-        </w:r>
-        <w:r>
-          <w:rPr>
-            <w:rStyle w:val="Hyperlink"/>
-            <w:noProof/>
-          </w:rPr>
-          <w:t>{{Study and Dose}}</w:t>
-        </w:r>
-        <w:r>
-          <w:rPr>
-            <w:rStyle w:val="Hyperlink"/>
-            <w:noProof/>
-          </w:rPr>
-          <w:t xml:space="preserve"> (log scale)</w:t>
-        </w:r>
-        <w:r>
-          <w:rPr>
-            <w:noProof/>
-          </w:rPr>
-          <w:tab/>
-        </w:r>
-        <w:r>
-          <w:rPr>
-            <w:noProof/>
-          </w:rPr>
-          <w:fldChar w:fldCharType="begin"/>
-        </w:r>
-        <w:r>
-          <w:rPr>
-            <w:noProof/>
-          </w:rPr>
-          <w:instrText xml:space="preserve"> PAGEREF _Toc224140115 \h </w:instrText>
-        </w:r>
-        <w:r>
-          <w:rPr>
-            <w:noProof/>
-          </w:rPr>
-        </w:r>
-        <w:r>
-          <w:rPr>
-            <w:noProof/>
-          </w:rPr>
-          <w:fldChar w:fldCharType="separate"/>
-        </w:r>
-        <w:r>
-          <w:rPr>
-            <w:noProof/>
-          </w:rPr>
-          <w:t>26</w:t>
-        </w:r>
-        <w:r>
-          <w:rPr>
-            <w:noProof/>
-          </w:rPr>
-          <w:fldChar w:fldCharType="end"/>
-        </w:r>
-      </w:hyperlink>
-    </w:p>
-    <w:p>
-      <w:pPr>
-        <w:pStyle w:val="TableofFigures"/>
-        <w:rPr>
-          <w:rFonts w:eastAsiaTheme="minorEastAsia" w:cstheme="minorBidi"/>
-          <w:noProof/>
-          <w:kern w:val="2"/>
-          <w14:ligatures w14:val="standardContextual"/>
-        </w:rPr>
-      </w:pPr>
-      <w:hyperlink w:anchor="_Toc224140116" w:history="1">
-        <w:r>
-          <w:rPr>
-            <w:rStyle w:val="Hyperlink"/>
-            <w:noProof/>
-          </w:rPr>
-          <w:t>Figure 7</w:t>
-        </w:r>
-        <w:r>
-          <w:rPr>
-            <w:rStyle w:val="Hyperlink"/>
-            <w:noProof/>
-          </w:rPr>
-          <w:tab/>
-          <w:t xml:space="preserve">Dose-normalized Concentrations versus Time by </w:t>
-        </w:r>
-        <w:r>
-          <w:rPr>
-            <w:rStyle w:val="Hyperlink"/>
-            <w:noProof/>
-            <w:highlight w:val="cyan"/>
-          </w:rPr>
-          <w:t>{{Study and Dose}}</w:t>
-        </w:r>
-        <w:r>
-          <w:rPr>
-            <w:rStyle w:val="Hyperlink"/>
-            <w:noProof/>
-          </w:rPr>
-          <w:t xml:space="preserve"> (log scale)</w:t>
-        </w:r>
-        <w:r>
-          <w:rPr>
-            <w:noProof/>
-          </w:rPr>
-          <w:tab/>
-        </w:r>
-        <w:r>
-          <w:rPr>
-            <w:noProof/>
-          </w:rPr>
-          <w:fldChar w:fldCharType="begin"/>
-        </w:r>
-        <w:r>
-          <w:rPr>
-            <w:noProof/>
-          </w:rPr>
-          <w:instrText xml:space="preserve"> PAGEREF _Toc224140116 \h </w:instrText>
-        </w:r>
-        <w:r>
-          <w:rPr>
-            <w:noProof/>
-          </w:rPr>
-        </w:r>
-        <w:r>
-          <w:rPr>
-            <w:noProof/>
-          </w:rPr>
-          <w:fldChar w:fldCharType="separate"/>
-        </w:r>
-        <w:r>
-          <w:rPr>
-            <w:noProof/>
-          </w:rPr>
-          <w:t>27</w:t>
-        </w:r>
-        <w:r>
-          <w:rPr>
-            <w:noProof/>
-          </w:rPr>
-          <w:fldChar w:fldCharType="end"/>
-        </w:r>
-      </w:hyperlink>
-    </w:p>
-    <w:p>
-      <w:pPr>
-        <w:pStyle w:val="TableofFigures"/>
-        <w:rPr>
-          <w:rFonts w:eastAsiaTheme="minorEastAsia" w:cstheme="minorBidi"/>
-          <w:noProof/>
-          <w:kern w:val="2"/>
-          <w14:ligatures w14:val="standardContextual"/>
-        </w:rPr>
-      </w:pPr>
-      <w:hyperlink w:anchor="_Toc224140117" w:history="1">
-        <w:r>
-          <w:rPr>
-            <w:rStyle w:val="Hyperlink"/>
-            <w:noProof/>
-          </w:rPr>
-          <w:t>Figure 8</w:t>
-        </w:r>
-        <w:r>
-          <w:rPr>
-            <w:rStyle w:val="Hyperlink"/>
-            <w:noProof/>
-          </w:rPr>
-          <w:tab/>
-          <w:t>Correlation between Empirical Bayes Estimates and continuous covariates</w:t>
-        </w:r>
-        <w:r>
-          <w:rPr>
-            <w:noProof/>
-          </w:rPr>
-          <w:tab/>
-        </w:r>
-        <w:r>
-          <w:rPr>
-            <w:noProof/>
-          </w:rPr>
-          <w:fldChar w:fldCharType="begin"/>
-        </w:r>
-        <w:r>
-          <w:rPr>
-            <w:noProof/>
-          </w:rPr>
-          <w:instrText xml:space="preserve"> PAGEREF _Toc224140117 \h </w:instrText>
-        </w:r>
-        <w:r>
-          <w:rPr>
-            <w:noProof/>
-          </w:rPr>
-        </w:r>
-        <w:r>
-          <w:rPr>
-            <w:noProof/>
-          </w:rPr>
-          <w:fldChar w:fldCharType="separate"/>
-        </w:r>
-        <w:r>
-          <w:rPr>
-            <w:noProof/>
-          </w:rPr>
-          <w:t>30</w:t>
-        </w:r>
-        <w:r>
-          <w:rPr>
-            <w:noProof/>
-          </w:rPr>
-          <w:fldChar w:fldCharType="end"/>
-        </w:r>
-      </w:hyperlink>
-    </w:p>
-    <w:p>
-      <w:pPr>
-        <w:pStyle w:val="TableofFigures"/>
-        <w:rPr>
-          <w:rFonts w:eastAsiaTheme="minorEastAsia" w:cstheme="minorBidi"/>
-          <w:noProof/>
-          <w:kern w:val="2"/>
-          <w14:ligatures w14:val="standardContextual"/>
-        </w:rPr>
-      </w:pPr>
-      <w:hyperlink w:anchor="_Toc224140118" w:history="1">
-        <w:r>
-          <w:rPr>
-            <w:rStyle w:val="Hyperlink"/>
-            <w:noProof/>
-          </w:rPr>
-          <w:t>Figure 9</w:t>
-        </w:r>
-        <w:r>
-          <w:rPr>
-            <w:rStyle w:val="Hyperlink"/>
-            <w:noProof/>
-          </w:rPr>
-          <w:tab/>
-          <w:t>Correlation Between Empirical Bayes Estimates and Categorical Covariates</w:t>
-        </w:r>
-        <w:r>
-          <w:rPr>
-            <w:noProof/>
-          </w:rPr>
-          <w:tab/>
-        </w:r>
-        <w:r>
-          <w:rPr>
-            <w:noProof/>
-          </w:rPr>
-          <w:fldChar w:fldCharType="begin"/>
-        </w:r>
-        <w:r>
-          <w:rPr>
-            <w:noProof/>
-          </w:rPr>
-          <w:instrText xml:space="preserve"> PAGEREF _Toc224140118 \h </w:instrText>
-        </w:r>
-        <w:r>
-          <w:rPr>
-            <w:noProof/>
-          </w:rPr>
-        </w:r>
-        <w:r>
-          <w:rPr>
-            <w:noProof/>
-          </w:rPr>
-          <w:fldChar w:fldCharType="separate"/>
-        </w:r>
-        <w:r>
-          <w:rPr>
-            <w:noProof/>
-          </w:rPr>
-          <w:t>30</w:t>
-        </w:r>
-        <w:r>
-          <w:rPr>
-            <w:noProof/>
-          </w:rPr>
-          <w:fldChar w:fldCharType="end"/>
-        </w:r>
-      </w:hyperlink>
-    </w:p>
-    <w:p>
-      <w:pPr>
-        <w:pStyle w:val="TableofFigures"/>
-        <w:rPr>
-          <w:rFonts w:eastAsiaTheme="minorEastAsia" w:cstheme="minorBidi"/>
-          <w:noProof/>
-          <w:kern w:val="2"/>
-          <w14:ligatures w14:val="standardContextual"/>
-        </w:rPr>
-      </w:pPr>
-      <w:hyperlink w:anchor="_Toc224140119" w:history="1">
-        <w:r>
-          <w:rPr>
-            <w:rStyle w:val="Hyperlink"/>
-            <w:noProof/>
-          </w:rPr>
-          <w:t>Figure 10</w:t>
-        </w:r>
-        <w:r>
-          <w:rPr>
-            <w:rStyle w:val="Hyperlink"/>
-            <w:noProof/>
-          </w:rPr>
-          <w:tab/>
-        </w:r>
-        <w:r>
-          <w:rPr>
-            <w:rStyle w:val="Hyperlink"/>
-            <w:noProof/>
-          </w:rPr>
-          <w:t>Goodness</w:t>
-        </w:r>
-        <w:r>
-          <w:rPr>
-            <w:noProof/>
-          </w:rPr>
-          <w:tab/>
-        </w:r>
-        <w:r>
-          <w:rPr>
-            <w:noProof/>
-          </w:rPr>
-          <w:fldChar w:fldCharType="begin"/>
-        </w:r>
-        <w:r>
-          <w:rPr>
-            <w:noProof/>
-          </w:rPr>
-          <w:instrText xml:space="preserve"> PAGEREF _Toc224140119 \h </w:instrText>
-        </w:r>
-        <w:r>
-          <w:rPr>
-            <w:noProof/>
-          </w:rPr>
-        </w:r>
-        <w:r>
-          <w:rPr>
-            <w:noProof/>
-          </w:rPr>
-          <w:fldChar w:fldCharType="separate"/>
-        </w:r>
-        <w:r>
-          <w:rPr>
-            <w:noProof/>
-          </w:rPr>
-          <w:t>31</w:t>
-        </w:r>
-        <w:r>
-          <w:rPr>
-            <w:noProof/>
-          </w:rPr>
-          <w:fldChar w:fldCharType="end"/>
-        </w:r>
-      </w:hyperlink>
-    </w:p>
-    <w:p>
-      <w:pPr>
-        <w:pStyle w:val="TableofFigures"/>
-        <w:rPr>
-          <w:rFonts w:eastAsiaTheme="minorEastAsia" w:cstheme="minorBidi"/>
-          <w:noProof/>
-          <w:kern w:val="2"/>
-          <w14:ligatures w14:val="standardContextual"/>
-        </w:rPr>
-      </w:pPr>
-      <w:hyperlink w:anchor="_Toc224140120" w:history="1">
-        <w:r>
-          <w:rPr>
-            <w:rStyle w:val="Hyperlink"/>
-            <w:noProof/>
-          </w:rPr>
-          <w:t>Figure 11</w:t>
-        </w:r>
-        <w:r>
-          <w:rPr>
-            <w:rStyle w:val="Hyperlink"/>
-            <w:noProof/>
-          </w:rPr>
-          <w:tab/>
-          <w:t>Estimates</w:t>
-        </w:r>
-        <w:r>
-          <w:rPr>
-            <w:noProof/>
-          </w:rPr>
-          <w:tab/>
-        </w:r>
-        <w:r>
-          <w:rPr>
-            <w:noProof/>
-          </w:rPr>
-          <w:fldChar w:fldCharType="begin"/>
-        </w:r>
-        <w:r>
-          <w:rPr>
-            <w:noProof/>
-          </w:rPr>
-          <w:instrText xml:space="preserve"> PAGEREF _Toc224140120 \h </w:instrText>
-        </w:r>
-        <w:r>
-          <w:rPr>
-            <w:noProof/>
-          </w:rPr>
-        </w:r>
-        <w:r>
-          <w:rPr>
-            <w:noProof/>
-          </w:rPr>
-          <w:fldChar w:fldCharType="separate"/>
-        </w:r>
-        <w:r>
-          <w:rPr>
-            <w:noProof/>
-          </w:rPr>
-          <w:t>31</w:t>
-        </w:r>
-        <w:r>
-          <w:rPr>
-            <w:noProof/>
-          </w:rPr>
-          <w:fldChar w:fldCharType="end"/>
-        </w:r>
-      </w:hyperlink>
-    </w:p>
-    <w:p>
-      <w:pPr>
-        <w:pStyle w:val="TableofFigures"/>
-        <w:rPr>
-          <w:rFonts w:eastAsiaTheme="minorEastAsia" w:cstheme="minorBidi"/>
-          <w:noProof/>
-          <w:kern w:val="2"/>
-          <w14:ligatures w14:val="standardContextual"/>
-        </w:rPr>
-      </w:pPr>
-      <w:hyperlink w:anchor="_Toc224140121" w:history="1">
-        <w:r>
-          <w:rPr>
-            <w:rStyle w:val="Hyperlink"/>
-            <w:noProof/>
-          </w:rPr>
-          <w:t>Figure 12</w:t>
-        </w:r>
-        <w:r>
-          <w:rPr>
-            <w:rStyle w:val="Hyperlink"/>
-            <w:noProof/>
-          </w:rPr>
-          <w:tab/>
-          <w:t>Visual Predictive Check</w:t>
-        </w:r>
-        <w:r>
-          <w:rPr>
-            <w:noProof/>
-          </w:rPr>
-          <w:tab/>
-        </w:r>
-        <w:r>
-          <w:rPr>
-            <w:noProof/>
-          </w:rPr>
-          <w:fldChar w:fldCharType="begin"/>
-        </w:r>
-        <w:r>
-          <w:rPr>
-            <w:noProof/>
-          </w:rPr>
-          <w:instrText xml:space="preserve"> PAGEREF _Toc224140121 \h </w:instrText>
-        </w:r>
-        <w:r>
-          <w:rPr>
-            <w:noProof/>
-          </w:rPr>
-        </w:r>
-        <w:r>
-          <w:rPr>
-            <w:noProof/>
-          </w:rPr>
-          <w:fldChar w:fldCharType="separate"/>
-        </w:r>
-        <w:r>
-          <w:rPr>
-            <w:noProof/>
-          </w:rPr>
-          <w:t>31</w:t>
-        </w:r>
-        <w:r>
-          <w:rPr>
-            <w:noProof/>
-          </w:rPr>
-          <w:fldChar w:fldCharType="end"/>
-        </w:r>
-      </w:hyperlink>
-    </w:p>
-    <w:p>
-      <w:pPr>
-        <w:pStyle w:val="TableofFigures"/>
-        <w:rPr>
-          <w:rFonts w:eastAsiaTheme="minorEastAsia" w:cstheme="minorBidi"/>
-          <w:noProof/>
-          <w:kern w:val="2"/>
-          <w14:ligatures w14:val="standardContextual"/>
-        </w:rPr>
-      </w:pPr>
-      <w:hyperlink w:anchor="_Toc224140122" w:history="1">
-        <w:r>
-          <w:rPr>
-            <w:rStyle w:val="Hyperlink"/>
-            <w:noProof/>
-          </w:rPr>
-          <w:t>Figure 13</w:t>
-        </w:r>
-        <w:r>
-          <w:rPr>
-            <w:rStyle w:val="Hyperlink"/>
-            <w:noProof/>
-          </w:rPr>
-          <w:tab/>
-          <w:t>Forest Plot</w:t>
-        </w:r>
-        <w:r>
-          <w:rPr>
-            <w:noProof/>
-          </w:rPr>
-          <w:tab/>
-        </w:r>
-        <w:r>
-          <w:rPr>
-            <w:noProof/>
-          </w:rPr>
-          <w:fldChar w:fldCharType="begin"/>
-        </w:r>
-        <w:r>
-          <w:rPr>
-            <w:noProof/>
-          </w:rPr>
-          <w:instrText xml:space="preserve"> PAGEREF _Toc224140122 \h </w:instrText>
-        </w:r>
-        <w:r>
-          <w:rPr>
-            <w:noProof/>
-          </w:rPr>
-        </w:r>
-        <w:r>
-          <w:rPr>
-            <w:noProof/>
-          </w:rPr>
-          <w:fldChar w:fldCharType="separate"/>
-        </w:r>
-        <w:r>
-          <w:rPr>
-            <w:noProof/>
-          </w:rPr>
-          <w:t>32</w:t>
-        </w:r>
-        <w:r>
-          <w:rPr>
-            <w:noProof/>
-          </w:rPr>
-          <w:fldChar w:fldCharType="end"/>
-        </w:r>
-      </w:hyperlink>
-    </w:p>
-    <w:p>
-      <w:pPr>
-        <w:pStyle w:val="TableofFigures"/>
-        <w:rPr>
-          <w:rFonts w:eastAsiaTheme="minorEastAsia" w:cstheme="minorBidi"/>
-          <w:noProof/>
-          <w:kern w:val="2"/>
-          <w14:ligatures w14:val="standardContextual"/>
-        </w:rPr>
-      </w:pPr>
-      <w:hyperlink w:anchor="_Toc224140123" w:history="1">
-        <w:r>
-          <w:rPr>
-            <w:rStyle w:val="Hyperlink"/>
-            <w:noProof/>
-          </w:rPr>
-          <w:t>Figure 14</w:t>
-        </w:r>
-        <w:r>
-          <w:rPr>
-            <w:rStyle w:val="Hyperlink"/>
-            <w:noProof/>
-          </w:rPr>
-          <w:tab/>
-          <w:t>Individual Predicted Exposures versus Covariate</w:t>
-        </w:r>
-        <w:r>
-          <w:rPr>
-            <w:noProof/>
-          </w:rPr>
-          <w:tab/>
-        </w:r>
-        <w:r>
-          <w:rPr>
-            <w:noProof/>
-          </w:rPr>
-          <w:fldChar w:fldCharType="begin"/>
-        </w:r>
-        <w:r>
-          <w:rPr>
-            <w:noProof/>
-          </w:rPr>
-          <w:instrText xml:space="preserve"> PAGEREF _Toc224140123 \h </w:instrText>
-        </w:r>
-        <w:r>
-          <w:rPr>
-            <w:noProof/>
-          </w:rPr>
-        </w:r>
-        <w:r>
-          <w:rPr>
-            <w:noProof/>
-          </w:rPr>
-          <w:fldChar w:fldCharType="separate"/>
-        </w:r>
-        <w:r>
-          <w:rPr>
-            <w:noProof/>
-          </w:rPr>
-          <w:t>32</w:t>
-        </w:r>
-        <w:r>
-          <w:rPr>
-            <w:noProof/>
-          </w:rPr>
-          <w:fldChar w:fldCharType="end"/>
-        </w:r>
-      </w:hyperlink>
-    </w:p>
-    <w:p>
-      <w:pPr>
-        <w:pStyle w:val="TableofFigures"/>
-        <w:rPr>
-          <w:rFonts w:eastAsiaTheme="minorEastAsia" w:cstheme="minorBidi"/>
-          <w:noProof/>
-          <w:kern w:val="2"/>
-          <w14:ligatures w14:val="standardContextual"/>
-        </w:rPr>
-      </w:pPr>
-      <w:hyperlink w:anchor="_Toc224140124" w:history="1">
-        <w:r>
-          <w:rPr>
-            <w:rStyle w:val="Hyperlink"/>
-            <w:noProof/>
-          </w:rPr>
-          <w:t>Figure D1</w:t>
-        </w:r>
-        <w:r>
-          <w:rPr>
-            <w:rStyle w:val="Hyperlink"/>
-            <w:noProof/>
-          </w:rPr>
-          <w:tab/>
-          <w:t>Histogram of concentration sample collection times coloured by analysis status</w:t>
-        </w:r>
-        <w:r>
-          <w:rPr>
-            <w:noProof/>
-          </w:rPr>
-          <w:tab/>
-        </w:r>
-        <w:r>
-          <w:rPr>
-            <w:noProof/>
-          </w:rPr>
-          <w:fldChar w:fldCharType="begin"/>
-        </w:r>
-        <w:r>
-          <w:rPr>
-            <w:noProof/>
-          </w:rPr>
-          <w:instrText xml:space="preserve"> PAGEREF _Toc224140124 \h </w:instrText>
-        </w:r>
-        <w:r>
-          <w:rPr>
-            <w:noProof/>
-          </w:rPr>
-        </w:r>
-        <w:r>
-          <w:rPr>
-            <w:noProof/>
-          </w:rPr>
-          <w:fldChar w:fldCharType="separate"/>
-        </w:r>
-        <w:r>
-          <w:rPr>
-            <w:noProof/>
-          </w:rPr>
-          <w:t>39</w:t>
-        </w:r>
-        <w:r>
-          <w:rPr>
-            <w:noProof/>
-          </w:rPr>
-          <w:fldChar w:fldCharType="end"/>
-        </w:r>
-      </w:hyperlink>
-    </w:p>
-    <w:p>
-      <w:pPr>
-        <w:pStyle w:val="TableofFigures"/>
-        <w:rPr>
-          <w:rFonts w:eastAsiaTheme="minorEastAsia" w:cstheme="minorBidi"/>
-          <w:noProof/>
-          <w:kern w:val="2"/>
-          <w14:ligatures w14:val="standardContextual"/>
-        </w:rPr>
-      </w:pPr>
-      <w:hyperlink w:anchor="_Toc224140125" w:history="1">
-        <w:r>
-          <w:rPr>
-            <w:rStyle w:val="Hyperlink"/>
-            <w:noProof/>
-          </w:rPr>
-          <w:t>Figure D2</w:t>
-        </w:r>
-        <w:r>
-          <w:rPr>
-            <w:rStyle w:val="Hyperlink"/>
-            <w:noProof/>
-          </w:rPr>
-          <w:tab/>
-          <w:t>Correlation between Continuous Covariates and Child-Pugh Score</w:t>
-        </w:r>
-        <w:r>
-          <w:rPr>
-            <w:noProof/>
-          </w:rPr>
-          <w:tab/>
-        </w:r>
-        <w:r>
-          <w:rPr>
-            <w:noProof/>
-          </w:rPr>
-          <w:fldChar w:fldCharType="begin"/>
-        </w:r>
-        <w:r>
-          <w:rPr>
-            <w:noProof/>
-          </w:rPr>
-          <w:instrText xml:space="preserve"> PAGEREF _Toc224140125 \h </w:instrText>
-        </w:r>
-        <w:r>
-          <w:rPr>
-            <w:noProof/>
-          </w:rPr>
-        </w:r>
-        <w:r>
-          <w:rPr>
-            <w:noProof/>
-          </w:rPr>
-          <w:fldChar w:fldCharType="separate"/>
-        </w:r>
-        <w:r>
-          <w:rPr>
-            <w:noProof/>
-          </w:rPr>
-          <w:t>40</w:t>
-        </w:r>
-        <w:r>
-          <w:rPr>
-            <w:noProof/>
-          </w:rPr>
-          <w:fldChar w:fldCharType="end"/>
-        </w:r>
-      </w:hyperlink>
-    </w:p>
-    <w:p>
-      <w:pPr>
-        <w:pStyle w:val="TableofFigures"/>
-        <w:rPr>
-          <w:rFonts w:eastAsiaTheme="minorEastAsia" w:cstheme="minorBidi"/>
-          <w:noProof/>
-          <w:kern w:val="2"/>
-          <w14:ligatures w14:val="standardContextual"/>
-        </w:rPr>
-      </w:pPr>
-      <w:hyperlink w:anchor="_Toc224140126" w:history="1">
-        <w:r>
-          <w:rPr>
-            <w:rStyle w:val="Hyperlink"/>
-            <w:noProof/>
-          </w:rPr>
-          <w:t>Figure D3</w:t>
-        </w:r>
-        <w:r>
-          <w:rPr>
-            <w:rStyle w:val="Hyperlink"/>
-            <w:noProof/>
-          </w:rPr>
-          <w:tab/>
-          <w:t xml:space="preserve">Concentrations versus Time by </w:t>
-        </w:r>
-        <w:r>
-          <w:rPr>
-            <w:rStyle w:val="Hyperlink"/>
-            <w:noProof/>
-            <w:highlight w:val="cyan"/>
-          </w:rPr>
-          <w:t>{{Study and Dose}}</w:t>
-        </w:r>
-        <w:r>
-          <w:rPr>
-            <w:rStyle w:val="Hyperlink"/>
-            <w:noProof/>
-          </w:rPr>
-          <w:t xml:space="preserve"> (linear scale)</w:t>
-        </w:r>
-        <w:r>
-          <w:rPr>
-            <w:noProof/>
-          </w:rPr>
-          <w:tab/>
-        </w:r>
-        <w:r>
-          <w:rPr>
-            <w:noProof/>
-          </w:rPr>
-          <w:fldChar w:fldCharType="begin"/>
-        </w:r>
-        <w:r>
-          <w:rPr>
-            <w:noProof/>
-          </w:rPr>
-          <w:instrText xml:space="preserve"> PAGEREF _Toc224140126 \h </w:instrText>
-        </w:r>
-        <w:r>
-          <w:rPr>
-            <w:noProof/>
-          </w:rPr>
-        </w:r>
-        <w:r>
-          <w:rPr>
-            <w:noProof/>
-          </w:rPr>
-          <w:fldChar w:fldCharType="separate"/>
-        </w:r>
-        <w:r>
-          <w:rPr>
-            <w:noProof/>
-          </w:rPr>
-          <w:t>41</w:t>
-        </w:r>
-        <w:r>
-          <w:rPr>
-            <w:noProof/>
-          </w:rPr>
-          <w:fldChar w:fldCharType="end"/>
-        </w:r>
-      </w:hyperlink>
-    </w:p>
-    <w:p>
-      <w:pPr>
-        <w:pStyle w:val="TableofFigures"/>
-        <w:rPr>
-          <w:rFonts w:eastAsiaTheme="minorEastAsia" w:cstheme="minorBidi"/>
-          <w:noProof/>
-          <w:kern w:val="2"/>
-          <w14:ligatures w14:val="standardContextual"/>
-        </w:rPr>
-      </w:pPr>
-      <w:hyperlink w:anchor="_Toc224140127" w:history="1">
-        <w:r>
-          <w:rPr>
-            <w:rStyle w:val="Hyperlink"/>
-            <w:noProof/>
-          </w:rPr>
-          <w:t>Figure D4</w:t>
-        </w:r>
-        <w:r>
-          <w:rPr>
-            <w:rStyle w:val="Hyperlink"/>
-            <w:noProof/>
-          </w:rPr>
-          <w:tab/>
-          <w:t xml:space="preserve">Concentrations versus Time after Dose by </w:t>
-        </w:r>
-        <w:r>
-          <w:rPr>
-            <w:rStyle w:val="Hyperlink"/>
-            <w:noProof/>
-            <w:highlight w:val="cyan"/>
-          </w:rPr>
-          <w:t>{{Study and Dose}}</w:t>
-        </w:r>
-        <w:r>
-          <w:rPr>
-            <w:rStyle w:val="Hyperlink"/>
-            <w:noProof/>
-          </w:rPr>
-          <w:t xml:space="preserve"> (linear scale)</w:t>
-        </w:r>
-        <w:r>
-          <w:rPr>
-            <w:noProof/>
-          </w:rPr>
-          <w:tab/>
-        </w:r>
-        <w:r>
-          <w:rPr>
-            <w:noProof/>
-          </w:rPr>
-          <w:fldChar w:fldCharType="begin"/>
-        </w:r>
-        <w:r>
-          <w:rPr>
-            <w:noProof/>
-          </w:rPr>
-          <w:instrText xml:space="preserve"> PAGEREF _Toc224140127 \h </w:instrText>
-        </w:r>
-        <w:r>
-          <w:rPr>
-            <w:noProof/>
-          </w:rPr>
-        </w:r>
-        <w:r>
-          <w:rPr>
-            <w:noProof/>
-          </w:rPr>
-          <w:fldChar w:fldCharType="separate"/>
-        </w:r>
-        <w:r>
-          <w:rPr>
-            <w:noProof/>
-          </w:rPr>
-          <w:t>42</w:t>
-        </w:r>
-        <w:r>
-          <w:rPr>
-            <w:noProof/>
-          </w:rPr>
-          <w:fldChar w:fldCharType="end"/>
-        </w:r>
-      </w:hyperlink>
-    </w:p>
-    <w:p>
-      <w:pPr>
-        <w:pStyle w:val="TableofFigures"/>
-        <w:rPr>
-          <w:rFonts w:eastAsiaTheme="minorEastAsia" w:cstheme="minorBidi"/>
-          <w:noProof/>
-          <w:kern w:val="2"/>
-          <w14:ligatures w14:val="standardContextual"/>
-        </w:rPr>
-      </w:pPr>
-      <w:hyperlink w:anchor="_Toc224140128" w:history="1">
-        <w:r>
-          <w:rPr>
-            <w:rStyle w:val="Hyperlink"/>
-            <w:noProof/>
-          </w:rPr>
-          <w:t>Figure D5</w:t>
-        </w:r>
-        <w:r>
-          <w:rPr>
-            <w:rStyle w:val="Hyperlink"/>
-            <w:noProof/>
-          </w:rPr>
-          <w:tab/>
-          <w:t xml:space="preserve">Dose-normalized Concentrations versus Time by </w:t>
-        </w:r>
-        <w:r>
-          <w:rPr>
-            <w:rStyle w:val="Hyperlink"/>
-            <w:noProof/>
-          </w:rPr>
-          <w:t>{{Study and Dose}}</w:t>
-        </w:r>
-        <w:r>
-          <w:rPr>
-            <w:rStyle w:val="Hyperlink"/>
-            <w:noProof/>
-          </w:rPr>
-          <w:t xml:space="preserve"> (linear scale)</w:t>
-        </w:r>
-        <w:r>
-          <w:rPr>
-            <w:noProof/>
-          </w:rPr>
-          <w:tab/>
-        </w:r>
-        <w:r>
-          <w:rPr>
-            <w:noProof/>
-          </w:rPr>
-          <w:fldChar w:fldCharType="begin"/>
-        </w:r>
-        <w:r>
-          <w:rPr>
-            <w:noProof/>
-          </w:rPr>
-          <w:instrText xml:space="preserve"> PAGEREF _Toc224140128 \h </w:instrText>
-        </w:r>
-        <w:r>
-          <w:rPr>
-            <w:noProof/>
-          </w:rPr>
-        </w:r>
-        <w:r>
-          <w:rPr>
-            <w:noProof/>
-          </w:rPr>
-          <w:fldChar w:fldCharType="separate"/>
-        </w:r>
-        <w:r>
-          <w:rPr>
-            <w:noProof/>
-          </w:rPr>
-          <w:t>43</w:t>
-        </w:r>
-        <w:r>
-          <w:rPr>
-            <w:noProof/>
-          </w:rPr>
-          <w:fldChar w:fldCharType="end"/>
-        </w:r>
-      </w:hyperlink>
-    </w:p>
-    <w:p>
-      <w:pPr>
-        <w:pStyle w:val="TableofFigures"/>
-        <w:rPr>
-          <w:rFonts w:eastAsiaTheme="minorEastAsia" w:cstheme="minorBidi"/>
-          <w:noProof/>
-          <w:kern w:val="2"/>
-          <w14:ligatures w14:val="standardContextual"/>
-        </w:rPr>
-      </w:pPr>
-      <w:hyperlink w:anchor="_Toc224140129" w:history="1">
-        <w:r>
-          <w:rPr>
-            <w:rStyle w:val="Hyperlink"/>
-            <w:noProof/>
-          </w:rPr>
-          <w:t>Figure D6</w:t>
-        </w:r>
-        <w:r>
-          <w:rPr>
-            <w:rStyle w:val="Hyperlink"/>
-            <w:noProof/>
-          </w:rPr>
-          <w:tab/>
-          <w:t>Predicted versus Observed Concentrations for Base Model</w:t>
-        </w:r>
-        <w:r>
-          <w:rPr>
-            <w:noProof/>
-          </w:rPr>
-          <w:tab/>
-        </w:r>
-        <w:r>
-          <w:rPr>
-            <w:noProof/>
-          </w:rPr>
-          <w:fldChar w:fldCharType="begin"/>
-        </w:r>
-        <w:r>
-          <w:rPr>
-            <w:noProof/>
-          </w:rPr>
-          <w:instrText xml:space="preserve"> PAGEREF _Toc224140129 \h </w:instrText>
-        </w:r>
-        <w:r>
-          <w:rPr>
-            <w:noProof/>
-          </w:rPr>
-        </w:r>
-        <w:r>
-          <w:rPr>
-            <w:noProof/>
-          </w:rPr>
-          <w:fldChar w:fldCharType="separate"/>
-        </w:r>
-        <w:r>
-          <w:rPr>
-            <w:noProof/>
-          </w:rPr>
-          <w:t>44</w:t>
-        </w:r>
-        <w:r>
-          <w:rPr>
-            <w:noProof/>
-          </w:rPr>
-          <w:fldChar w:fldCharType="end"/>
-        </w:r>
-      </w:hyperlink>
-    </w:p>
-    <w:p>
-      <w:pPr>
-        <w:pStyle w:val="TableofFigures"/>
-        <w:rPr>
-          <w:rFonts w:eastAsiaTheme="minorEastAsia" w:cstheme="minorBidi"/>
-          <w:noProof/>
-          <w:kern w:val="2"/>
-          <w14:ligatures w14:val="standardContextual"/>
-        </w:rPr>
-      </w:pPr>
-      <w:hyperlink w:anchor="_Toc224140130" w:history="1">
-        <w:r>
-          <w:rPr>
-            <w:rStyle w:val="Hyperlink"/>
-            <w:noProof/>
-          </w:rPr>
-          <w:t>Figure D7</w:t>
-        </w:r>
-        <w:r>
-          <w:rPr>
-            <w:rStyle w:val="Hyperlink"/>
-            <w:noProof/>
-          </w:rPr>
-          <w:tab/>
-          <w:t>Evaluation of Residuals for Base Model</w:t>
-        </w:r>
-        <w:r>
-          <w:rPr>
-            <w:noProof/>
-          </w:rPr>
-          <w:tab/>
-        </w:r>
-        <w:r>
-          <w:rPr>
-            <w:noProof/>
-          </w:rPr>
-          <w:fldChar w:fldCharType="begin"/>
-        </w:r>
-        <w:r>
-          <w:rPr>
-            <w:noProof/>
-          </w:rPr>
-          <w:instrText xml:space="preserve"> PAGEREF _Toc224140130 \h </w:instrText>
-        </w:r>
-        <w:r>
-          <w:rPr>
-            <w:noProof/>
-          </w:rPr>
-        </w:r>
-        <w:r>
-          <w:rPr>
-            <w:noProof/>
-          </w:rPr>
-          <w:fldChar w:fldCharType="separate"/>
-        </w:r>
-        <w:r>
-          <w:rPr>
-            <w:noProof/>
-          </w:rPr>
-          <w:t>45</w:t>
-        </w:r>
-        <w:r>
-          <w:rPr>
-            <w:noProof/>
-          </w:rPr>
-          <w:fldChar w:fldCharType="end"/>
-        </w:r>
-      </w:hyperlink>
-    </w:p>
-    <w:p>
-      <w:pPr>
-        <w:pStyle w:val="TableofFigures"/>
-        <w:rPr>
-          <w:rFonts w:eastAsiaTheme="minorEastAsia" w:cstheme="minorBidi"/>
-          <w:noProof/>
-          <w:kern w:val="2"/>
-          <w14:ligatures w14:val="standardContextual"/>
-        </w:rPr>
-      </w:pPr>
-      <w:hyperlink w:anchor="_Toc224140131" w:history="1">
-        <w:r>
-          <w:rPr>
-            <w:rStyle w:val="Hyperlink"/>
-            <w:noProof/>
-          </w:rPr>
-          <w:t>Figure D8</w:t>
-        </w:r>
-        <w:r>
-          <w:rPr>
-            <w:rStyle w:val="Hyperlink"/>
-            <w:noProof/>
-          </w:rPr>
-          <w:tab/>
-        </w:r>
-        <w:r>
-          <w:rPr>
-            <w:rStyle w:val="Hyperlink"/>
-            <w:noProof/>
-            <w:highlight w:val="cyan"/>
-          </w:rPr>
-          <w:t>{{pc}}</w:t>
-        </w:r>
-        <w:r>
-          <w:rPr>
-            <w:rStyle w:val="Hyperlink"/>
-            <w:noProof/>
-          </w:rPr>
-          <w:t xml:space="preserve">VPC of </w:t>
-        </w:r>
-        <w:r>
-          <w:rPr>
-            <w:rStyle w:val="Hyperlink"/>
-            <w:noProof/>
-            <w:highlight w:val="cyan"/>
-          </w:rPr>
-          <w:t>{{dose-normalized}}</w:t>
-        </w:r>
-        <w:r>
-          <w:rPr>
-            <w:rStyle w:val="Hyperlink"/>
-            <w:noProof/>
-          </w:rPr>
-          <w:t xml:space="preserve"> Concentration versus Time after dose by </w:t>
-        </w:r>
-        <w:r>
-          <w:rPr>
-            <w:rStyle w:val="Hyperlink"/>
-            <w:noProof/>
-            <w:highlight w:val="cyan"/>
-          </w:rPr>
-          <w:t>{{Study}}</w:t>
-        </w:r>
-        <w:r>
-          <w:rPr>
-            <w:rStyle w:val="Hyperlink"/>
-            <w:noProof/>
-          </w:rPr>
-          <w:t xml:space="preserve"> for Base Model</w:t>
-        </w:r>
-        <w:r>
-          <w:rPr>
-            <w:noProof/>
-          </w:rPr>
-          <w:tab/>
-        </w:r>
-        <w:r>
-          <w:rPr>
-            <w:noProof/>
-          </w:rPr>
-          <w:fldChar w:fldCharType="begin"/>
-        </w:r>
-        <w:r>
-          <w:rPr>
-            <w:noProof/>
-          </w:rPr>
-          <w:instrText xml:space="preserve"> PAGEREF _Toc224140131 \h </w:instrText>
-        </w:r>
-        <w:r>
-          <w:rPr>
-            <w:noProof/>
-          </w:rPr>
-        </w:r>
-        <w:r>
-          <w:rPr>
-            <w:noProof/>
-          </w:rPr>
-          <w:fldChar w:fldCharType="separate"/>
-        </w:r>
-        <w:r>
-          <w:rPr>
-            <w:noProof/>
-          </w:rPr>
-          <w:t>46</w:t>
-        </w:r>
-        <w:r>
-          <w:rPr>
-            <w:noProof/>
-          </w:rPr>
-          <w:fldChar w:fldCharType="end"/>
-        </w:r>
-      </w:hyperlink>
-    </w:p>
-    <w:p>
-      <w:pPr>
-        <w:pStyle w:val="TableofFigures"/>
-        <w:rPr>
-          <w:rFonts w:eastAsiaTheme="minorEastAsia" w:cstheme="minorBidi"/>
-          <w:noProof/>
-          <w:kern w:val="2"/>
-          <w14:ligatures w14:val="standardContextual"/>
-        </w:rPr>
-      </w:pPr>
-      <w:hyperlink w:anchor="_Toc224140132" w:history="1">
-        <w:r>
-          <w:rPr>
-            <w:rStyle w:val="Hyperlink"/>
-            <w:noProof/>
-          </w:rPr>
-          <w:t>Figure D8</w:t>
-        </w:r>
-        <w:r>
-          <w:rPr>
-            <w:rStyle w:val="Hyperlink"/>
-            <w:noProof/>
-          </w:rPr>
-          <w:tab/>
-        </w:r>
-        <w:r>
-          <w:rPr>
-            <w:rStyle w:val="Hyperlink"/>
-            <w:noProof/>
-            <w:highlight w:val="cyan"/>
-          </w:rPr>
-          <w:t>{{pc}}</w:t>
-        </w:r>
-        <w:r>
-          <w:rPr>
-            <w:rStyle w:val="Hyperlink"/>
-            <w:noProof/>
-          </w:rPr>
-          <w:t xml:space="preserve">VPC of </w:t>
-        </w:r>
-        <w:r>
-          <w:rPr>
-            <w:rStyle w:val="Hyperlink"/>
-            <w:noProof/>
-            <w:highlight w:val="cyan"/>
-          </w:rPr>
-          <w:t>{{dose-normalized}}</w:t>
-        </w:r>
-        <w:r>
-          <w:rPr>
-            <w:rStyle w:val="Hyperlink"/>
-            <w:noProof/>
-          </w:rPr>
-          <w:t xml:space="preserve"> Concentration versus Time after dose by </w:t>
-        </w:r>
-        <w:r>
-          <w:rPr>
-            <w:rStyle w:val="Hyperlink"/>
-            <w:noProof/>
-            <w:highlight w:val="cyan"/>
-          </w:rPr>
-          <w:t>{{renal function}}</w:t>
-        </w:r>
-        <w:r>
-          <w:rPr>
-            <w:rStyle w:val="Hyperlink"/>
-            <w:noProof/>
-          </w:rPr>
-          <w:t xml:space="preserve"> for Base Model</w:t>
-        </w:r>
-        <w:r>
-          <w:rPr>
-            <w:noProof/>
-          </w:rPr>
-          <w:tab/>
-        </w:r>
-        <w:r>
-          <w:rPr>
-            <w:noProof/>
-          </w:rPr>
-          <w:fldChar w:fldCharType="begin"/>
-        </w:r>
-        <w:r>
-          <w:rPr>
-            <w:noProof/>
-          </w:rPr>
-          <w:instrText xml:space="preserve"> PAGEREF _Toc224140132 \h </w:instrText>
-        </w:r>
-        <w:r>
-          <w:rPr>
-            <w:noProof/>
-          </w:rPr>
-        </w:r>
-        <w:r>
-          <w:rPr>
-            <w:noProof/>
-          </w:rPr>
-          <w:fldChar w:fldCharType="separate"/>
-        </w:r>
-        <w:r>
-          <w:rPr>
-            <w:noProof/>
-          </w:rPr>
-          <w:t>47</w:t>
-        </w:r>
-        <w:r>
-          <w:rPr>
-            <w:noProof/>
-          </w:rPr>
-          <w:fldChar w:fldCharType="end"/>
-        </w:r>
-      </w:hyperlink>
-    </w:p>
-    <w:p>
-      <w:pPr>
-        <w:pStyle w:val="TableofFigures"/>
-        <w:rPr>
-          <w:rFonts w:eastAsiaTheme="minorEastAsia" w:cstheme="minorBidi"/>
-          <w:noProof/>
-          <w:kern w:val="2"/>
-          <w14:ligatures w14:val="standardContextual"/>
-        </w:rPr>
-      </w:pPr>
-      <w:hyperlink w:anchor="_Toc224140133" w:history="1">
-        <w:r>
-          <w:rPr>
-            <w:rStyle w:val="Hyperlink"/>
-            <w:noProof/>
-          </w:rPr>
-          <w:t>Figure D9</w:t>
-        </w:r>
-        <w:r>
-          <w:rPr>
-            <w:rStyle w:val="Hyperlink"/>
-            <w:noProof/>
-          </w:rPr>
-          <w:tab/>
-          <w:t>Distribution and Correlation of Individual Random Effects for Base Model</w:t>
-        </w:r>
-        <w:r>
-          <w:rPr>
-            <w:noProof/>
-          </w:rPr>
-          <w:tab/>
-        </w:r>
-        <w:r>
-          <w:rPr>
-            <w:noProof/>
-          </w:rPr>
-          <w:fldChar w:fldCharType="begin"/>
-        </w:r>
-        <w:r>
-          <w:rPr>
-            <w:noProof/>
-          </w:rPr>
-          <w:instrText xml:space="preserve"> PAGEREF _Toc224140133 \h </w:instrText>
-        </w:r>
-        <w:r>
-          <w:rPr>
-            <w:noProof/>
-          </w:rPr>
-        </w:r>
-        <w:r>
-          <w:rPr>
-            <w:noProof/>
-          </w:rPr>
-          <w:fldChar w:fldCharType="separate"/>
-        </w:r>
-        <w:r>
-          <w:rPr>
-            <w:noProof/>
-          </w:rPr>
-          <w:t>48</w:t>
-        </w:r>
-        <w:r>
-          <w:rPr>
-            <w:noProof/>
-          </w:rPr>
-          <w:fldChar w:fldCharType="end"/>
-        </w:r>
-      </w:hyperlink>
-    </w:p>
-    <w:p>
-      <w:pPr>
-        <w:pStyle w:val="TableofFigures"/>
-        <w:rPr>
-          <w:rFonts w:eastAsiaTheme="minorEastAsia" w:cstheme="minorBidi"/>
-          <w:noProof/>
-          <w:kern w:val="2"/>
-          <w14:ligatures w14:val="standardContextual"/>
-        </w:rPr>
-      </w:pPr>
-      <w:hyperlink w:anchor="_Toc224140134" w:history="1">
-        <w:r>
-          <w:rPr>
-            <w:rStyle w:val="Hyperlink"/>
-            <w:noProof/>
-          </w:rPr>
-          <w:t>Figure D10</w:t>
-        </w:r>
-        <w:r>
-          <w:rPr>
-            <w:rStyle w:val="Hyperlink"/>
-            <w:noProof/>
-          </w:rPr>
-          <w:tab/>
-          <w:t>Scatter Plot of Individual Random Effects for Ka versus Continuous Covariates for Base Model</w:t>
-        </w:r>
-        <w:r>
-          <w:rPr>
-            <w:noProof/>
-          </w:rPr>
-          <w:tab/>
-        </w:r>
-        <w:r>
-          <w:rPr>
-            <w:noProof/>
-          </w:rPr>
-          <w:fldChar w:fldCharType="begin"/>
-        </w:r>
-        <w:r>
-          <w:rPr>
-            <w:noProof/>
-          </w:rPr>
-          <w:instrText xml:space="preserve"> PAGEREF _Toc224140134 \h </w:instrText>
-        </w:r>
-        <w:r>
-          <w:rPr>
-            <w:noProof/>
-          </w:rPr>
-        </w:r>
-        <w:r>
-          <w:rPr>
-            <w:noProof/>
-          </w:rPr>
-          <w:fldChar w:fldCharType="separate"/>
-        </w:r>
-        <w:r>
-          <w:rPr>
-            <w:noProof/>
-          </w:rPr>
-          <w:t>49</w:t>
-        </w:r>
-        <w:r>
-          <w:rPr>
-            <w:noProof/>
-          </w:rPr>
-          <w:fldChar w:fldCharType="end"/>
-        </w:r>
-      </w:hyperlink>
-    </w:p>
-    <w:p>
-      <w:pPr>
-        <w:pStyle w:val="TableofFigures"/>
-        <w:rPr>
-          <w:rFonts w:eastAsiaTheme="minorEastAsia" w:cstheme="minorBidi"/>
-          <w:noProof/>
-          <w:kern w:val="2"/>
-          <w14:ligatures w14:val="standardContextual"/>
-        </w:rPr>
-      </w:pPr>
-      <w:hyperlink w:anchor="_Toc224140135" w:history="1">
-        <w:r>
-          <w:rPr>
-            <w:rStyle w:val="Hyperlink"/>
-            <w:noProof/>
-          </w:rPr>
-          <w:t>Figure D11</w:t>
-        </w:r>
-        <w:r>
-          <w:rPr>
-            <w:rStyle w:val="Hyperlink"/>
-            <w:noProof/>
-          </w:rPr>
-          <w:tab/>
-          <w:t>Scatter Plot of Individual Random Effects for Vc/F versus Continuous Covariates for Base Model</w:t>
-        </w:r>
-        <w:r>
-          <w:rPr>
-            <w:noProof/>
-          </w:rPr>
-          <w:tab/>
-        </w:r>
-        <w:r>
-          <w:rPr>
-            <w:noProof/>
-          </w:rPr>
-          <w:fldChar w:fldCharType="begin"/>
-        </w:r>
-        <w:r>
-          <w:rPr>
-            <w:noProof/>
-          </w:rPr>
-          <w:instrText xml:space="preserve"> PAGEREF _Toc224140135 \h </w:instrText>
-        </w:r>
-        <w:r>
-          <w:rPr>
-            <w:noProof/>
-          </w:rPr>
-        </w:r>
-        <w:r>
-          <w:rPr>
-            <w:noProof/>
-          </w:rPr>
-          <w:fldChar w:fldCharType="separate"/>
-        </w:r>
-        <w:r>
-          <w:rPr>
-            <w:noProof/>
-          </w:rPr>
-          <w:t>50</w:t>
-        </w:r>
-        <w:r>
-          <w:rPr>
-            <w:noProof/>
-          </w:rPr>
-          <w:fldChar w:fldCharType="end"/>
-        </w:r>
-      </w:hyperlink>
-    </w:p>
-    <w:p>
-      <w:pPr>
-        <w:pStyle w:val="TableofFigures"/>
-        <w:rPr>
-          <w:rFonts w:eastAsiaTheme="minorEastAsia" w:cstheme="minorBidi"/>
-          <w:noProof/>
-          <w:kern w:val="2"/>
-          <w14:ligatures w14:val="standardContextual"/>
-        </w:rPr>
-      </w:pPr>
-      <w:hyperlink w:anchor="_Toc224140136" w:history="1">
-        <w:r>
-          <w:rPr>
-            <w:rStyle w:val="Hyperlink"/>
-            <w:noProof/>
-          </w:rPr>
-          <w:t>Figure D12</w:t>
-        </w:r>
-        <w:r>
-          <w:rPr>
-            <w:rStyle w:val="Hyperlink"/>
-            <w:noProof/>
-          </w:rPr>
-          <w:tab/>
-          <w:t>Scatter Plot of Individual Random Effects for CL/F versus Continuous Covariates for Base Model</w:t>
-        </w:r>
-        <w:r>
-          <w:rPr>
-            <w:noProof/>
-          </w:rPr>
-          <w:tab/>
-        </w:r>
-        <w:r>
-          <w:rPr>
-            <w:noProof/>
-          </w:rPr>
-          <w:fldChar w:fldCharType="begin"/>
-        </w:r>
-        <w:r>
-          <w:rPr>
-            <w:noProof/>
-          </w:rPr>
-          <w:instrText xml:space="preserve"> PAGEREF _Toc224140136 \h </w:instrText>
-        </w:r>
-        <w:r>
-          <w:rPr>
-            <w:noProof/>
-          </w:rPr>
-        </w:r>
-        <w:r>
-          <w:rPr>
-            <w:noProof/>
-          </w:rPr>
-          <w:fldChar w:fldCharType="separate"/>
-        </w:r>
-        <w:r>
-          <w:rPr>
-            <w:noProof/>
-          </w:rPr>
-          <w:t>51</w:t>
-        </w:r>
-        <w:r>
-          <w:rPr>
-            <w:noProof/>
-          </w:rPr>
-          <w:fldChar w:fldCharType="end"/>
-        </w:r>
-      </w:hyperlink>
-    </w:p>
-    <w:p>
-      <w:pPr>
-        <w:pStyle w:val="TableofFigures"/>
-        <w:rPr>
-          <w:rFonts w:eastAsiaTheme="minorEastAsia" w:cstheme="minorBidi"/>
-          <w:noProof/>
-          <w:kern w:val="2"/>
-          <w14:ligatures w14:val="standardContextual"/>
-        </w:rPr>
-      </w:pPr>
-      <w:hyperlink w:anchor="_Toc224140137" w:history="1">
-        <w:r>
-          <w:rPr>
-            <w:rStyle w:val="Hyperlink"/>
-            <w:noProof/>
-          </w:rPr>
-          <w:t>Figure D13</w:t>
-        </w:r>
-        <w:r>
-          <w:rPr>
-            <w:rStyle w:val="Hyperlink"/>
-            <w:noProof/>
-          </w:rPr>
-          <w:tab/>
-          <w:t>Distribution of Individual Random Estimates of Ka by Category of Categorical Covariates for Base Model</w:t>
-        </w:r>
-        <w:r>
-          <w:rPr>
-            <w:noProof/>
-          </w:rPr>
-          <w:tab/>
-        </w:r>
-        <w:r>
-          <w:rPr>
-            <w:noProof/>
-          </w:rPr>
-          <w:fldChar w:fldCharType="begin"/>
-        </w:r>
-        <w:r>
-          <w:rPr>
-            <w:noProof/>
-          </w:rPr>
-          <w:instrText xml:space="preserve"> PAGEREF _Toc224140137 \h </w:instrText>
-        </w:r>
-        <w:r>
-          <w:rPr>
-            <w:noProof/>
-          </w:rPr>
-        </w:r>
-        <w:r>
-          <w:rPr>
-            <w:noProof/>
-          </w:rPr>
-          <w:fldChar w:fldCharType="separate"/>
-        </w:r>
-        <w:r>
-          <w:rPr>
-            <w:noProof/>
-          </w:rPr>
-          <w:t>52</w:t>
-        </w:r>
-        <w:r>
-          <w:rPr>
-            <w:noProof/>
-          </w:rPr>
-          <w:fldChar w:fldCharType="end"/>
-        </w:r>
-      </w:hyperlink>
-    </w:p>
-    <w:p>
-      <w:pPr>
-        <w:pStyle w:val="TableofFigures"/>
-        <w:rPr>
-          <w:rFonts w:eastAsiaTheme="minorEastAsia" w:cstheme="minorBidi"/>
-          <w:noProof/>
-          <w:kern w:val="2"/>
-          <w14:ligatures w14:val="standardContextual"/>
-        </w:rPr>
-      </w:pPr>
-      <w:hyperlink w:anchor="_Toc224140138" w:history="1">
-        <w:r>
-          <w:rPr>
-            <w:rStyle w:val="Hyperlink"/>
-            <w:noProof/>
-          </w:rPr>
-          <w:t>Figure D14</w:t>
-        </w:r>
-        <w:r>
-          <w:rPr>
-            <w:rStyle w:val="Hyperlink"/>
-            <w:noProof/>
-          </w:rPr>
-          <w:tab/>
-          <w:t>Distribution of Individual Random Estimates of Vc/F by Category of Categorical Covariates for Base Model</w:t>
-        </w:r>
-        <w:r>
-          <w:rPr>
-            <w:noProof/>
-          </w:rPr>
-          <w:tab/>
-        </w:r>
-        <w:r>
-          <w:rPr>
-            <w:noProof/>
-          </w:rPr>
-          <w:fldChar w:fldCharType="begin"/>
-        </w:r>
-        <w:r>
-          <w:rPr>
-            <w:noProof/>
-          </w:rPr>
-          <w:instrText xml:space="preserve"> PAGEREF _Toc224140138 \h </w:instrText>
-        </w:r>
-        <w:r>
-          <w:rPr>
-            <w:noProof/>
-          </w:rPr>
-        </w:r>
-        <w:r>
-          <w:rPr>
-            <w:noProof/>
-          </w:rPr>
-          <w:fldChar w:fldCharType="separate"/>
-        </w:r>
-        <w:r>
-          <w:rPr>
-            <w:noProof/>
-          </w:rPr>
-          <w:t>53</w:t>
-        </w:r>
-        <w:r>
-          <w:rPr>
-            <w:noProof/>
-          </w:rPr>
-          <w:fldChar w:fldCharType="end"/>
-        </w:r>
-      </w:hyperlink>
-    </w:p>
-    <w:p>
-      <w:pPr>
-        <w:pStyle w:val="TableofFigures"/>
-        <w:rPr>
-          <w:rFonts w:eastAsiaTheme="minorEastAsia" w:cstheme="minorBidi"/>
-          <w:noProof/>
-          <w:kern w:val="2"/>
-          <w14:ligatures w14:val="standardContextual"/>
-        </w:rPr>
-      </w:pPr>
-      <w:hyperlink w:anchor="_Toc224140139" w:history="1">
-        <w:r>
-          <w:rPr>
-            <w:rStyle w:val="Hyperlink"/>
-            <w:noProof/>
-          </w:rPr>
-          <w:t>Figure D15</w:t>
-        </w:r>
-        <w:r>
-          <w:rPr>
-            <w:rStyle w:val="Hyperlink"/>
-            <w:noProof/>
-          </w:rPr>
-          <w:tab/>
-          <w:t>Distribution of Individual Random Estimates of CL/F by Category of Categorical Covariates for Base Model</w:t>
-        </w:r>
-        <w:r>
-          <w:rPr>
-            <w:noProof/>
-          </w:rPr>
-          <w:tab/>
-        </w:r>
-        <w:r>
-          <w:rPr>
-            <w:noProof/>
-          </w:rPr>
-          <w:fldChar w:fldCharType="begin"/>
-        </w:r>
-        <w:r>
-          <w:rPr>
-            <w:noProof/>
-          </w:rPr>
-          <w:instrText xml:space="preserve"> PAGEREF _Toc224140139 \h </w:instrText>
-        </w:r>
-        <w:r>
-          <w:rPr>
-            <w:noProof/>
-          </w:rPr>
-        </w:r>
-        <w:r>
-          <w:rPr>
-            <w:noProof/>
-          </w:rPr>
-          <w:fldChar w:fldCharType="separate"/>
-        </w:r>
-        <w:r>
-          <w:rPr>
-            <w:noProof/>
-          </w:rPr>
-          <w:t>54</w:t>
-        </w:r>
-        <w:r>
-          <w:rPr>
-            <w:noProof/>
-          </w:rPr>
-          <w:fldChar w:fldCharType="end"/>
-        </w:r>
-      </w:hyperlink>
-    </w:p>
-    <w:p>
-      <w:pPr>
-        <w:pStyle w:val="TableofFigures"/>
-        <w:rPr>
-          <w:rFonts w:eastAsiaTheme="minorEastAsia" w:cstheme="minorBidi"/>
-          <w:noProof/>
-          <w:kern w:val="2"/>
-          <w14:ligatures w14:val="standardContextual"/>
-        </w:rPr>
-      </w:pPr>
-      <w:hyperlink w:anchor="_Toc224140140" w:history="1">
-        <w:r>
-          <w:rPr>
-            <w:rStyle w:val="Hyperlink"/>
-            <w:noProof/>
-          </w:rPr>
-          <w:t>Figure D16</w:t>
-        </w:r>
-        <w:r>
-          <w:rPr>
-            <w:rStyle w:val="Hyperlink"/>
-            <w:noProof/>
-          </w:rPr>
-          <w:tab/>
-          <w:t>Distribution and Correlation of Individual Random Effects for Final Model</w:t>
-        </w:r>
-        <w:r>
-          <w:rPr>
-            <w:noProof/>
-          </w:rPr>
-          <w:tab/>
-        </w:r>
-        <w:r>
-          <w:rPr>
-            <w:noProof/>
-          </w:rPr>
-          <w:fldChar w:fldCharType="begin"/>
-        </w:r>
-        <w:r>
-          <w:rPr>
-            <w:noProof/>
-          </w:rPr>
-          <w:instrText xml:space="preserve"> PAGEREF _Toc224140140 \h </w:instrText>
-        </w:r>
-        <w:r>
-          <w:rPr>
-            <w:noProof/>
-          </w:rPr>
-        </w:r>
-        <w:r>
-          <w:rPr>
-            <w:noProof/>
-          </w:rPr>
-          <w:fldChar w:fldCharType="separate"/>
-        </w:r>
-        <w:r>
-          <w:rPr>
-            <w:noProof/>
-          </w:rPr>
-          <w:t>59</w:t>
-        </w:r>
-        <w:r>
-          <w:rPr>
-            <w:noProof/>
-          </w:rPr>
-          <w:fldChar w:fldCharType="end"/>
-        </w:r>
-      </w:hyperlink>
-    </w:p>
-    <w:p>
-      <w:pPr>
-        <w:pStyle w:val="TableofFigures"/>
-        <w:rPr>
-          <w:rFonts w:eastAsiaTheme="minorEastAsia" w:cstheme="minorBidi"/>
-          <w:noProof/>
-          <w:kern w:val="2"/>
-          <w14:ligatures w14:val="standardContextual"/>
-        </w:rPr>
-      </w:pPr>
-      <w:hyperlink w:anchor="_Toc224140141" w:history="1">
-        <w:r>
-          <w:rPr>
-            <w:rStyle w:val="Hyperlink"/>
-            <w:noProof/>
-          </w:rPr>
-          <w:t>Figure D17</w:t>
-        </w:r>
-        <w:r>
-          <w:rPr>
-            <w:rStyle w:val="Hyperlink"/>
-            <w:noProof/>
-          </w:rPr>
-          <w:tab/>
-          <w:t>Scatter Plot of Individual Random Effects for Ka versus Continuous Covariates for Final Model</w:t>
-        </w:r>
-        <w:r>
-          <w:rPr>
-            <w:noProof/>
-          </w:rPr>
-          <w:tab/>
-        </w:r>
-        <w:r>
-          <w:rPr>
-            <w:noProof/>
-          </w:rPr>
-          <w:fldChar w:fldCharType="begin"/>
-        </w:r>
-        <w:r>
-          <w:rPr>
-            <w:noProof/>
-          </w:rPr>
-          <w:instrText xml:space="preserve"> PAGEREF _Toc224140141 \h </w:instrText>
-        </w:r>
-        <w:r>
-          <w:rPr>
-            <w:noProof/>
-          </w:rPr>
-        </w:r>
-        <w:r>
-          <w:rPr>
-            <w:noProof/>
-          </w:rPr>
-          <w:fldChar w:fldCharType="separate"/>
-        </w:r>
-        <w:r>
-          <w:rPr>
-            <w:noProof/>
-          </w:rPr>
-          <w:t>60</w:t>
-        </w:r>
-        <w:r>
-          <w:rPr>
-            <w:noProof/>
-          </w:rPr>
-          <w:fldChar w:fldCharType="end"/>
-        </w:r>
-      </w:hyperlink>
-    </w:p>
-    <w:p>
-      <w:pPr>
-        <w:pStyle w:val="TableofFigures"/>
-        <w:rPr>
-          <w:rFonts w:eastAsiaTheme="minorEastAsia" w:cstheme="minorBidi"/>
-          <w:noProof/>
-          <w:kern w:val="2"/>
-          <w14:ligatures w14:val="standardContextual"/>
-        </w:rPr>
-      </w:pPr>
-      <w:hyperlink w:anchor="_Toc224140142" w:history="1">
-        <w:r>
-          <w:rPr>
-            <w:rStyle w:val="Hyperlink"/>
-            <w:noProof/>
-          </w:rPr>
-          <w:t>Figure D18</w:t>
-        </w:r>
-        <w:r>
-          <w:rPr>
-            <w:rStyle w:val="Hyperlink"/>
-            <w:noProof/>
-          </w:rPr>
-          <w:tab/>
-          <w:t>Scatter Plot of Individual Random Effects for Vc/F versus Continuous Covariates for Final Model</w:t>
-        </w:r>
-        <w:r>
-          <w:rPr>
-            <w:noProof/>
-          </w:rPr>
-          <w:tab/>
-        </w:r>
-        <w:r>
-          <w:rPr>
-            <w:noProof/>
-          </w:rPr>
-          <w:fldChar w:fldCharType="begin"/>
-        </w:r>
-        <w:r>
-          <w:rPr>
-            <w:noProof/>
-          </w:rPr>
-          <w:instrText xml:space="preserve"> PAGEREF _Toc224140142 \h </w:instrText>
-        </w:r>
-        <w:r>
-          <w:rPr>
-            <w:noProof/>
-          </w:rPr>
-        </w:r>
-        <w:r>
-          <w:rPr>
-            <w:noProof/>
-          </w:rPr>
-          <w:fldChar w:fldCharType="separate"/>
-        </w:r>
-        <w:r>
-          <w:rPr>
-            <w:noProof/>
-          </w:rPr>
-          <w:t>61</w:t>
-        </w:r>
-        <w:r>
-          <w:rPr>
-            <w:noProof/>
-          </w:rPr>
-          <w:fldChar w:fldCharType="end"/>
-        </w:r>
-      </w:hyperlink>
-    </w:p>
-    <w:p>
-      <w:pPr>
-        <w:pStyle w:val="TableofFigures"/>
-        <w:rPr>
-          <w:rFonts w:eastAsiaTheme="minorEastAsia" w:cstheme="minorBidi"/>
-          <w:noProof/>
-          <w:kern w:val="2"/>
-          <w14:ligatures w14:val="standardContextual"/>
-        </w:rPr>
-      </w:pPr>
-      <w:hyperlink w:anchor="_Toc224140143" w:history="1">
-        <w:r>
-          <w:rPr>
-            <w:rStyle w:val="Hyperlink"/>
-            <w:noProof/>
-          </w:rPr>
-          <w:t>Figure D19</w:t>
-        </w:r>
-        <w:r>
-          <w:rPr>
-            <w:rStyle w:val="Hyperlink"/>
-            <w:noProof/>
-          </w:rPr>
-          <w:tab/>
-          <w:t>Scatter Plot of Individual Random Effects for CL/F versus Continuous Covariates for Final Model</w:t>
-        </w:r>
-        <w:r>
-          <w:rPr>
-            <w:noProof/>
-          </w:rPr>
-          <w:tab/>
-        </w:r>
-        <w:r>
-          <w:rPr>
-            <w:noProof/>
-          </w:rPr>
-          <w:fldChar w:fldCharType="begin"/>
-        </w:r>
-        <w:r>
-          <w:rPr>
-            <w:noProof/>
-          </w:rPr>
-          <w:instrText xml:space="preserve"> PAGEREF _Toc224140143 \h </w:instrText>
-        </w:r>
-        <w:r>
-          <w:rPr>
-            <w:noProof/>
-          </w:rPr>
-        </w:r>
-        <w:r>
-          <w:rPr>
-            <w:noProof/>
-          </w:rPr>
-          <w:fldChar w:fldCharType="separate"/>
-        </w:r>
-        <w:r>
-          <w:rPr>
-            <w:noProof/>
-          </w:rPr>
-          <w:t>62</w:t>
-        </w:r>
-        <w:r>
-          <w:rPr>
-            <w:noProof/>
-          </w:rPr>
-          <w:fldChar w:fldCharType="end"/>
-        </w:r>
-      </w:hyperlink>
-    </w:p>
-    <w:p>
-      <w:pPr>
-        <w:pStyle w:val="TableofFigures"/>
-        <w:rPr>
-          <w:rFonts w:eastAsiaTheme="minorEastAsia" w:cstheme="minorBidi"/>
-          <w:noProof/>
-          <w:kern w:val="2"/>
-          <w14:ligatures w14:val="standardContextual"/>
-        </w:rPr>
-      </w:pPr>
-      <w:hyperlink w:anchor="_Toc224140144" w:history="1">
-        <w:r>
-          <w:rPr>
-            <w:rStyle w:val="Hyperlink"/>
-            <w:noProof/>
-          </w:rPr>
-          <w:t>Figure D20</w:t>
-        </w:r>
-        <w:r>
-          <w:rPr>
-            <w:rStyle w:val="Hyperlink"/>
-            <w:noProof/>
-          </w:rPr>
-          <w:tab/>
-          <w:t>Distribution of Individual Random Estimates of Ka by Category of Categorical Covariates for Final Model</w:t>
-        </w:r>
-        <w:r>
-          <w:rPr>
-            <w:noProof/>
-          </w:rPr>
-          <w:tab/>
-        </w:r>
-        <w:r>
-          <w:rPr>
-            <w:noProof/>
-          </w:rPr>
-          <w:fldChar w:fldCharType="begin"/>
-        </w:r>
-        <w:r>
-          <w:rPr>
-            <w:noProof/>
-          </w:rPr>
-          <w:instrText xml:space="preserve"> PAGEREF _Toc224140144 \h </w:instrText>
-        </w:r>
-        <w:r>
-          <w:rPr>
-            <w:noProof/>
-          </w:rPr>
-        </w:r>
-        <w:r>
-          <w:rPr>
-            <w:noProof/>
-          </w:rPr>
-          <w:fldChar w:fldCharType="separate"/>
-        </w:r>
-        <w:r>
-          <w:rPr>
-            <w:noProof/>
-          </w:rPr>
-          <w:t>63</w:t>
-        </w:r>
-        <w:r>
-          <w:rPr>
-            <w:noProof/>
-          </w:rPr>
-          <w:fldChar w:fldCharType="end"/>
-        </w:r>
-      </w:hyperlink>
-    </w:p>
-    <w:p>
-      <w:pPr>
-        <w:pStyle w:val="TableofFigures"/>
-        <w:rPr>
-          <w:rFonts w:eastAsiaTheme="minorEastAsia" w:cstheme="minorBidi"/>
-          <w:noProof/>
-          <w:kern w:val="2"/>
-          <w14:ligatures w14:val="standardContextual"/>
-        </w:rPr>
-      </w:pPr>
-      <w:hyperlink w:anchor="_Toc224140145" w:history="1">
-        <w:r>
-          <w:rPr>
-            <w:rStyle w:val="Hyperlink"/>
-            <w:noProof/>
-          </w:rPr>
-          <w:t>Figure D21</w:t>
-        </w:r>
-        <w:r>
-          <w:rPr>
-            <w:rStyle w:val="Hyperlink"/>
-            <w:noProof/>
-          </w:rPr>
-          <w:tab/>
-          <w:t>Distribution of Individual Random Estimates of Vc/F by Category of Categorical Covariates for Final Model</w:t>
-        </w:r>
-        <w:r>
-          <w:rPr>
-            <w:noProof/>
-          </w:rPr>
-          <w:tab/>
-        </w:r>
-        <w:r>
-          <w:rPr>
-            <w:noProof/>
-          </w:rPr>
-          <w:fldChar w:fldCharType="begin"/>
-        </w:r>
-        <w:r>
-          <w:rPr>
-            <w:noProof/>
-          </w:rPr>
-          <w:instrText xml:space="preserve"> PAGEREF _Toc224140145 \h </w:instrText>
-        </w:r>
-        <w:r>
-          <w:rPr>
-            <w:noProof/>
-          </w:rPr>
-        </w:r>
-        <w:r>
-          <w:rPr>
-            <w:noProof/>
-          </w:rPr>
-          <w:fldChar w:fldCharType="separate"/>
-        </w:r>
-        <w:r>
-          <w:rPr>
-            <w:noProof/>
-          </w:rPr>
-          <w:t>64</w:t>
-        </w:r>
-        <w:r>
-          <w:rPr>
-            <w:noProof/>
-          </w:rPr>
-          <w:fldChar w:fldCharType="end"/>
-        </w:r>
-      </w:hyperlink>
-    </w:p>
-    <w:p>
-      <w:pPr>
-        <w:pStyle w:val="TableofFigures"/>
-        <w:rPr>
-          <w:rFonts w:eastAsiaTheme="minorEastAsia" w:cstheme="minorBidi"/>
-          <w:noProof/>
-          <w:kern w:val="2"/>
-          <w14:ligatures w14:val="standardContextual"/>
-        </w:rPr>
-      </w:pPr>
-      <w:hyperlink w:anchor="_Toc224140146" w:history="1">
-        <w:r>
-          <w:rPr>
-            <w:rStyle w:val="Hyperlink"/>
-            <w:noProof/>
-          </w:rPr>
-          <w:t>Figure D22</w:t>
-        </w:r>
-        <w:r>
-          <w:rPr>
-            <w:rStyle w:val="Hyperlink"/>
-            <w:noProof/>
-          </w:rPr>
-          <w:tab/>
-          <w:t>Distribution of Individual Random Estimates of CL/F by Category of Categorical Covariates for Final Model</w:t>
-        </w:r>
-        <w:r>
-          <w:rPr>
-            <w:noProof/>
-          </w:rPr>
-          <w:tab/>
-        </w:r>
-        <w:r>
-          <w:rPr>
-            <w:noProof/>
-          </w:rPr>
-          <w:fldChar w:fldCharType="begin"/>
-        </w:r>
-        <w:r>
-          <w:rPr>
-            <w:noProof/>
-          </w:rPr>
-          <w:instrText xml:space="preserve"> PAGEREF _Toc224140146 \h </w:instrText>
-        </w:r>
-        <w:r>
-          <w:rPr>
-            <w:noProof/>
-          </w:rPr>
-        </w:r>
-        <w:r>
-          <w:rPr>
-            <w:noProof/>
-          </w:rPr>
-          <w:fldChar w:fldCharType="separate"/>
-        </w:r>
-        <w:r>
-          <w:rPr>
-            <w:noProof/>
-          </w:rPr>
-          <w:t>65</w:t>
+          <w:t>23</w:t>
         </w:r>
         <w:r>
           <w:rPr>
@@ -8214,6 +5861,7 @@
         <w:pStyle w:val="Heading1NoTOC"/>
       </w:pPr>
       <w:r>
+        <w:lastRenderedPageBreak/>
         <w:t>LIST OF APPENDICES</w:t>
       </w:r>
     </w:p>
@@ -9030,11 +6678,19 @@
         </w:rPr>
         <w:t xml:space="preserve">performed in accordance </w:t>
       </w:r>
+      <w:proofErr w:type="gramStart"/>
       <w:r>
         <w:rPr>
           <w:lang w:val="en-US"/>
         </w:rPr>
-        <w:t xml:space="preserve">to the </w:t>
+        <w:t>to</w:t>
+      </w:r>
+      <w:proofErr w:type="gramEnd"/>
+      <w:r>
+        <w:rPr>
+          <w:lang w:val="en-US"/>
+        </w:rPr>
+        <w:t xml:space="preserve"> the </w:t>
       </w:r>
       <w:r>
         <w:rPr>
@@ -10051,6 +7707,7 @@
             <w:pPr>
               <w:pStyle w:val="TableLeft"/>
             </w:pPr>
+            <w:proofErr w:type="spellStart"/>
             <w:r>
               <w:rPr>
                 <w:lang w:val="en-US"/>
@@ -10064,6 +7721,7 @@
               </w:rPr>
               <w:t>max</w:t>
             </w:r>
+            <w:proofErr w:type="spellEnd"/>
           </w:p>
         </w:tc>
         <w:tc>
@@ -10095,6 +7753,7 @@
             <w:pPr>
               <w:pStyle w:val="TableLeft"/>
             </w:pPr>
+            <w:proofErr w:type="spellStart"/>
             <w:r>
               <w:rPr>
                 <w:lang w:val="en-US"/>
@@ -10108,6 +7767,7 @@
               </w:rPr>
               <w:t>trough</w:t>
             </w:r>
+            <w:proofErr w:type="spellEnd"/>
           </w:p>
         </w:tc>
         <w:tc>
@@ -10892,12 +8552,14 @@
             <w:pPr>
               <w:pStyle w:val="TableLeft"/>
             </w:pPr>
+            <w:proofErr w:type="spellStart"/>
             <w:r>
               <w:rPr>
                 <w:lang w:val="en-US"/>
               </w:rPr>
               <w:t>popPK</w:t>
             </w:r>
+            <w:proofErr w:type="spellEnd"/>
           </w:p>
         </w:tc>
         <w:tc>
@@ -11354,6 +9016,7 @@
             <w:pPr>
               <w:pStyle w:val="TableLeft"/>
             </w:pPr>
+            <w:proofErr w:type="spellStart"/>
             <w:r>
               <w:rPr>
                 <w:lang w:val="en-US"/>
@@ -11367,6 +9030,7 @@
               </w:rPr>
               <w:t>max</w:t>
             </w:r>
+            <w:proofErr w:type="spellEnd"/>
           </w:p>
         </w:tc>
         <w:tc>
@@ -11435,11 +9099,19 @@
             <w:pPr>
               <w:pStyle w:val="TableLeft"/>
             </w:pPr>
+            <w:proofErr w:type="spellStart"/>
             <w:r>
               <w:rPr>
                 <w:lang w:val="en-US"/>
               </w:rPr>
-              <w:t>Vc/F</w:t>
+              <w:t>Vc</w:t>
+            </w:r>
+            <w:proofErr w:type="spellEnd"/>
+            <w:r>
+              <w:rPr>
+                <w:lang w:val="en-US"/>
+              </w:rPr>
+              <w:t>/F</w:t>
             </w:r>
           </w:p>
         </w:tc>
@@ -11472,11 +9144,19 @@
             <w:pPr>
               <w:pStyle w:val="TableLeft"/>
             </w:pPr>
+            <w:proofErr w:type="spellStart"/>
             <w:r>
               <w:rPr>
                 <w:lang w:val="en-US"/>
               </w:rPr>
-              <w:t>Vp/F</w:t>
+              <w:t>Vp</w:t>
+            </w:r>
+            <w:proofErr w:type="spellEnd"/>
+            <w:r>
+              <w:rPr>
+                <w:lang w:val="en-US"/>
+              </w:rPr>
+              <w:t>/F</w:t>
             </w:r>
           </w:p>
         </w:tc>
@@ -11687,8 +9367,17 @@
                 <w:sz w:val="22"/>
                 <w:szCs w:val="22"/>
               </w:rPr>
-              <w:t xml:space="preserve"> are</w:t>
-            </w:r>
+              <w:t xml:space="preserve"> </w:t>
+            </w:r>
+            <w:proofErr w:type="gramStart"/>
+            <w:r>
+              <w:rPr>
+                <w:sz w:val="22"/>
+                <w:szCs w:val="22"/>
+              </w:rPr>
+              <w:t>are</w:t>
+            </w:r>
+            <w:proofErr w:type="gramEnd"/>
             <w:r>
               <w:rPr>
                 <w:sz w:val="22"/>
@@ -12073,15 +9762,33 @@
                 <w:szCs w:val="22"/>
                 <w:lang w:val="en-US"/>
               </w:rPr>
-              <w:t xml:space="preserve">Suggest to </w:t>
-            </w:r>
+              <w:t xml:space="preserve">Suggest </w:t>
+            </w:r>
+            <w:proofErr w:type="gramStart"/>
             <w:r>
               <w:rPr>
                 <w:sz w:val="22"/>
                 <w:szCs w:val="22"/>
                 <w:lang w:val="en-US"/>
               </w:rPr>
-              <w:t xml:space="preserve">use the same text as in the </w:t>
+              <w:t xml:space="preserve">to </w:t>
+            </w:r>
+            <w:r>
+              <w:rPr>
+                <w:sz w:val="22"/>
+                <w:szCs w:val="22"/>
+                <w:lang w:val="en-US"/>
+              </w:rPr>
+              <w:t>use</w:t>
+            </w:r>
+            <w:proofErr w:type="gramEnd"/>
+            <w:r>
+              <w:rPr>
+                <w:sz w:val="22"/>
+                <w:szCs w:val="22"/>
+                <w:lang w:val="en-US"/>
+              </w:rPr>
+              <w:t xml:space="preserve"> the same text as in the </w:t>
             </w:r>
             <w:r>
               <w:rPr>
@@ -12235,7 +9942,25 @@
                 <w:iCs/>
                 <w:lang w:val="en-US"/>
               </w:rPr>
-              <w:t>If developing a joint popPK E-R MAP, please include efficacy/safety objectives here as well.</w:t>
+              <w:t xml:space="preserve">If developing a joint </w:t>
+            </w:r>
+            <w:proofErr w:type="spellStart"/>
+            <w:r>
+              <w:rPr>
+                <w:i/>
+                <w:iCs/>
+                <w:lang w:val="en-US"/>
+              </w:rPr>
+              <w:t>popPK</w:t>
+            </w:r>
+            <w:proofErr w:type="spellEnd"/>
+            <w:r>
+              <w:rPr>
+                <w:i/>
+                <w:iCs/>
+                <w:lang w:val="en-US"/>
+              </w:rPr>
+              <w:t xml:space="preserve"> E-R MAP, please include efficacy/safety objectives here as well.</w:t>
             </w:r>
           </w:p>
         </w:tc>
@@ -12397,22 +10122,40 @@
                 <w:szCs w:val="22"/>
                 <w:lang w:val="en-US"/>
               </w:rPr>
-              <w:t>Essential information include description of studies, population/design, samples/participant(range), and sampling design information.</w:t>
-            </w:r>
-          </w:p>
-          <w:p>
-            <w:pPr>
-              <w:pStyle w:val="ListBullet"/>
-              <w:rPr>
-                <w:lang w:val="en-US"/>
-              </w:rPr>
-            </w:pPr>
+              <w:t xml:space="preserve">Essential information </w:t>
+            </w:r>
+            <w:proofErr w:type="gramStart"/>
             <w:r>
               <w:rPr>
                 <w:sz w:val="22"/>
                 <w:szCs w:val="22"/>
                 <w:lang w:val="en-US"/>
               </w:rPr>
+              <w:t>include</w:t>
+            </w:r>
+            <w:proofErr w:type="gramEnd"/>
+            <w:r>
+              <w:rPr>
+                <w:sz w:val="22"/>
+                <w:szCs w:val="22"/>
+                <w:lang w:val="en-US"/>
+              </w:rPr>
+              <w:t xml:space="preserve"> description of studies, population/design, samples/participant(range), and sampling design information.</w:t>
+            </w:r>
+          </w:p>
+          <w:p>
+            <w:pPr>
+              <w:pStyle w:val="ListBullet"/>
+              <w:rPr>
+                <w:lang w:val="en-US"/>
+              </w:rPr>
+            </w:pPr>
+            <w:r>
+              <w:rPr>
+                <w:sz w:val="22"/>
+                <w:szCs w:val="22"/>
+                <w:lang w:val="en-US"/>
+              </w:rPr>
               <w:t>The paragraph text should be minimal but may include e.g. the rational for the selection of the used data and/or explanations around study design(s) to provide context for the used modeling strategy.</w:t>
             </w:r>
           </w:p>
@@ -12426,7 +10169,25 @@
                 <w:iCs/>
                 <w:lang w:val="en-US"/>
               </w:rPr>
-              <w:t>If developing a joint popPK E-R MAP, please add a separate table for E/S data (if different from PK).</w:t>
+              <w:t xml:space="preserve">If developing a joint </w:t>
+            </w:r>
+            <w:proofErr w:type="spellStart"/>
+            <w:r>
+              <w:rPr>
+                <w:i/>
+                <w:iCs/>
+                <w:lang w:val="en-US"/>
+              </w:rPr>
+              <w:t>popPK</w:t>
+            </w:r>
+            <w:proofErr w:type="spellEnd"/>
+            <w:r>
+              <w:rPr>
+                <w:i/>
+                <w:iCs/>
+                <w:lang w:val="en-US"/>
+              </w:rPr>
+              <w:t xml:space="preserve"> E-R MAP, please add a separate table for E/S data (if different from PK).</w:t>
             </w:r>
           </w:p>
         </w:tc>
@@ -12762,18 +10523,27 @@
                 <w:lang w:val="en-US"/>
               </w:rPr>
             </w:pPr>
+            <w:proofErr w:type="spellStart"/>
             <w:r>
               <w:rPr>
                 <w:highlight w:val="cyan"/>
                 <w:lang w:val="en-US"/>
               </w:rPr>
-              <w:t xml:space="preserve">DxxxCxxxxx </w:t>
-            </w:r>
+              <w:t>DxxxCxxxxx</w:t>
+            </w:r>
+            <w:proofErr w:type="spellEnd"/>
             <w:r>
               <w:rPr>
                 <w:highlight w:val="cyan"/>
                 <w:lang w:val="en-US"/>
               </w:rPr>
+              <w:t xml:space="preserve"> </w:t>
+            </w:r>
+            <w:r>
+              <w:rPr>
+                <w:highlight w:val="cyan"/>
+                <w:lang w:val="en-US"/>
+              </w:rPr>
               <w:br/>
               <w:t>(Phase 1/SAD)</w:t>
             </w:r>
@@ -12797,8 +10567,17 @@
                 <w:highlight w:val="cyan"/>
                 <w:lang w:val="en-US"/>
               </w:rPr>
-              <w:t>DCO: dd/mm/yyyy</w:t>
-            </w:r>
+              <w:t>DCO: dd/mm/</w:t>
+            </w:r>
+            <w:proofErr w:type="spellStart"/>
+            <w:r>
+              <w:rPr>
+                <w:highlight w:val="cyan"/>
+                <w:lang w:val="en-US"/>
+              </w:rPr>
+              <w:t>yyyy</w:t>
+            </w:r>
+            <w:proofErr w:type="spellEnd"/>
           </w:p>
         </w:tc>
         <w:tc>
@@ -12923,6 +10702,7 @@
                 <w:lang w:val="en-US"/>
               </w:rPr>
             </w:pPr>
+            <w:proofErr w:type="spellStart"/>
             <w:r>
               <w:rPr>
                 <w:highlight w:val="cyan"/>
@@ -12930,6 +10710,7 @@
               </w:rPr>
               <w:t>DxxxCxxxxx</w:t>
             </w:r>
+            <w:proofErr w:type="spellEnd"/>
             <w:r>
               <w:rPr>
                 <w:highlight w:val="cyan"/>
@@ -12958,8 +10739,17 @@
                 <w:highlight w:val="cyan"/>
                 <w:lang w:val="en-US"/>
               </w:rPr>
-              <w:t>DCO: dd/mm/yyyy</w:t>
-            </w:r>
+              <w:t>DCO: dd/mm/</w:t>
+            </w:r>
+            <w:proofErr w:type="spellStart"/>
+            <w:r>
+              <w:rPr>
+                <w:highlight w:val="cyan"/>
+                <w:lang w:val="en-US"/>
+              </w:rPr>
+              <w:t>yyyy</w:t>
+            </w:r>
+            <w:proofErr w:type="spellEnd"/>
           </w:p>
         </w:tc>
         <w:tc>
@@ -13039,6 +10829,7 @@
                 <w:lang w:val="en-US"/>
               </w:rPr>
             </w:pPr>
+            <w:proofErr w:type="spellStart"/>
             <w:r>
               <w:rPr>
                 <w:highlight w:val="cyan"/>
@@ -13054,6 +10845,7 @@
               </w:rPr>
               <w:t>total</w:t>
             </w:r>
+            <w:proofErr w:type="spellEnd"/>
             <w:r>
               <w:rPr>
                 <w:highlight w:val="cyan"/>
@@ -13445,6 +11237,7 @@
       <w:r>
         <w:t xml:space="preserve">An analysis dataset </w:t>
       </w:r>
+      <w:proofErr w:type="gramStart"/>
       <w:r>
         <w:rPr>
           <w:highlight w:val="cyan"/>
@@ -13455,7 +11248,21 @@
         <w:rPr>
           <w:highlight w:val="cyan"/>
         </w:rPr>
-        <w:t xml:space="preserve"> name of source data file </w:t>
+        <w:t xml:space="preserve"> name</w:t>
+      </w:r>
+      <w:proofErr w:type="gramEnd"/>
+      <w:r>
+        <w:rPr>
+          <w:highlight w:val="cyan"/>
+        </w:rPr>
+        <w:t xml:space="preserve"> of source data </w:t>
+      </w:r>
+      <w:proofErr w:type="gramStart"/>
+      <w:r>
+        <w:rPr>
+          <w:highlight w:val="cyan"/>
+        </w:rPr>
+        <w:t xml:space="preserve">file </w:t>
       </w:r>
       <w:r>
         <w:rPr>
@@ -13463,6 +11270,7 @@
         </w:rPr>
         <w:t>}</w:t>
       </w:r>
+      <w:proofErr w:type="gramEnd"/>
       <w:r>
         <w:t>}</w:t>
       </w:r>
@@ -14119,7 +11927,16 @@
           <w:highlight w:val="cyan"/>
           <w:lang w:val="en-US"/>
         </w:rPr>
-        <w:t>&lt;&lt;text:</w:t>
+        <w:t>&lt;&lt;</w:t>
+      </w:r>
+      <w:proofErr w:type="spellStart"/>
+      <w:proofErr w:type="gramStart"/>
+      <w:r>
+        <w:rPr>
+          <w:highlight w:val="cyan"/>
+          <w:lang w:val="en-US"/>
+        </w:rPr>
+        <w:t>text:</w:t>
       </w:r>
       <w:r>
         <w:rPr>
@@ -14135,6 +11952,8 @@
         </w:rPr>
         <w:t>dd</w:t>
       </w:r>
+      <w:proofErr w:type="spellEnd"/>
+      <w:proofErr w:type="gramEnd"/>
       <w:r>
         <w:rPr>
           <w:highlight w:val="cyan"/>
@@ -14317,6 +12136,8 @@
         </w:rPr>
         <w:t>&lt;&lt;</w:t>
       </w:r>
+      <w:proofErr w:type="spellStart"/>
+      <w:proofErr w:type="gramStart"/>
       <w:r>
         <w:rPr>
           <w:highlight w:val="cyan"/>
@@ -14339,7 +12160,15 @@
         <w:rPr>
           <w:highlight w:val="cyan"/>
         </w:rPr>
-        <w:t>Add specific considerations/strategies used</w:t>
+        <w:t>Add</w:t>
+      </w:r>
+      <w:proofErr w:type="spellEnd"/>
+      <w:proofErr w:type="gramEnd"/>
+      <w:r>
+        <w:rPr>
+          <w:highlight w:val="cyan"/>
+        </w:rPr>
+        <w:t xml:space="preserve"> specific considerations/strategies used</w:t>
       </w:r>
       <w:r>
         <w:rPr>
@@ -15416,12 +13245,16 @@
       <w:r>
         <w:t>&lt;&lt;</w:t>
       </w:r>
+      <w:proofErr w:type="spellStart"/>
+      <w:proofErr w:type="gramStart"/>
       <w:r>
         <w:t>image:</w:t>
       </w:r>
       <w:r>
         <w:t>model</w:t>
       </w:r>
+      <w:proofErr w:type="spellEnd"/>
+      <w:proofErr w:type="gramEnd"/>
       <w:r>
         <w:t xml:space="preserve"> </w:t>
       </w:r>
@@ -15666,12 +13499,16 @@
       <w:r>
         <w:t>&lt;&lt;</w:t>
       </w:r>
+      <w:proofErr w:type="spellStart"/>
+      <w:proofErr w:type="gramStart"/>
       <w:r>
         <w:t>table:</w:t>
       </w:r>
       <w:r>
         <w:t>categorical</w:t>
       </w:r>
+      <w:proofErr w:type="spellEnd"/>
+      <w:proofErr w:type="gramEnd"/>
       <w:r>
         <w:t xml:space="preserve"> </w:t>
       </w:r>
@@ -16253,6 +14090,8 @@
         </w:rPr>
         <w:t>&lt;&lt;</w:t>
       </w:r>
+      <w:proofErr w:type="spellStart"/>
+      <w:proofErr w:type="gramStart"/>
       <w:r>
         <w:rPr>
           <w:sz w:val="22"/>
@@ -16283,7 +14122,17 @@
           <w:szCs w:val="22"/>
           <w:highlight w:val="cyan"/>
         </w:rPr>
-        <w:t>dose&gt;&gt;</w:t>
+        <w:t>dose</w:t>
+      </w:r>
+      <w:proofErr w:type="spellEnd"/>
+      <w:proofErr w:type="gramEnd"/>
+      <w:r>
+        <w:rPr>
+          <w:sz w:val="22"/>
+          <w:szCs w:val="22"/>
+          <w:highlight w:val="cyan"/>
+        </w:rPr>
+        <w:t>&gt;&gt;</w:t>
       </w:r>
       <w:r>
         <w:rPr>
@@ -17936,15 +15785,33 @@
         <w:pStyle w:val="TableFootnoteInfo"/>
       </w:pPr>
       <w:r>
-        <w:t>Source code: eda-tables.R</w:t>
-      </w:r>
+        <w:t xml:space="preserve">Source code: </w:t>
+      </w:r>
+      <w:proofErr w:type="spellStart"/>
+      <w:r>
+        <w:t>eda-</w:t>
+      </w:r>
+      <w:proofErr w:type="gramStart"/>
+      <w:r>
+        <w:t>tables.R</w:t>
+      </w:r>
+      <w:proofErr w:type="spellEnd"/>
+      <w:proofErr w:type="gramEnd"/>
     </w:p>
     <w:p>
       <w:pPr>
         <w:pStyle w:val="TableFootnoteInfo"/>
       </w:pPr>
       <w:r>
-        <w:t>Source file: results/table/eda/pk-data-sum-dose.docx</w:t>
+        <w:t>Source file: results/table/</w:t>
+      </w:r>
+      <w:proofErr w:type="spellStart"/>
+      <w:r>
+        <w:t>eda</w:t>
+      </w:r>
+      <w:proofErr w:type="spellEnd"/>
+      <w:r>
+        <w:t>/pk-data-sum-dose.docx</w:t>
       </w:r>
     </w:p>
     <w:p>
@@ -18036,13 +15903,27 @@
         <w:rPr>
           <w:highlight w:val="cyan"/>
         </w:rPr>
-        <w:t xml:space="preserve">across dose levels of </w:t>
-      </w:r>
+        <w:t xml:space="preserve">across dose levels </w:t>
+      </w:r>
+      <w:proofErr w:type="gramStart"/>
       <w:r>
         <w:rPr>
           <w:highlight w:val="cyan"/>
         </w:rPr>
-        <w:t xml:space="preserve"> {{</w:t>
+        <w:t xml:space="preserve">of </w:t>
+      </w:r>
+      <w:r>
+        <w:rPr>
+          <w:highlight w:val="cyan"/>
+        </w:rPr>
+        <w:t xml:space="preserve"> {</w:t>
+      </w:r>
+      <w:proofErr w:type="gramEnd"/>
+      <w:r>
+        <w:rPr>
+          <w:highlight w:val="cyan"/>
+        </w:rPr>
+        <w:t>{</w:t>
       </w:r>
       <w:r>
         <w:rPr>
@@ -18381,7 +16262,29 @@
                   <w:szCs w:val="22"/>
                   <w:u w:val="single"/>
                 </w:rPr>
-                <w:t>General Considerations for Tables, Figures, Listings (TFL) for popPK reports from Clinical Pharmacology &amp; Quantitative Pharmacology CPQP</w:t>
+                <w:t xml:space="preserve">General Considerations for Tables, Figures, Listings (TFL) for </w:t>
+              </w:r>
+              <w:proofErr w:type="spellStart"/>
+              <w:r>
+                <w:rPr>
+                  <w:rStyle w:val="cf01"/>
+                  <w:color w:val="0000FF"/>
+                  <w:sz w:val="22"/>
+                  <w:szCs w:val="22"/>
+                  <w:u w:val="single"/>
+                </w:rPr>
+                <w:t>popPK</w:t>
+              </w:r>
+              <w:proofErr w:type="spellEnd"/>
+              <w:r>
+                <w:rPr>
+                  <w:rStyle w:val="cf01"/>
+                  <w:color w:val="0000FF"/>
+                  <w:sz w:val="22"/>
+                  <w:szCs w:val="22"/>
+                  <w:u w:val="single"/>
+                </w:rPr>
+                <w:t xml:space="preserve"> reports from Clinical Pharmacology &amp; Quantitative Pharmacology CPQP</w:t>
               </w:r>
             </w:hyperlink>
           </w:p>
@@ -20119,15 +18022,33 @@
         <w:pStyle w:val="TableFootnoteInfo"/>
       </w:pPr>
       <w:r>
-        <w:t>Source code: eda-tables.R</w:t>
-      </w:r>
+        <w:t xml:space="preserve">Source code: </w:t>
+      </w:r>
+      <w:proofErr w:type="spellStart"/>
+      <w:r>
+        <w:t>eda-</w:t>
+      </w:r>
+      <w:proofErr w:type="gramStart"/>
+      <w:r>
+        <w:t>tables.R</w:t>
+      </w:r>
+      <w:proofErr w:type="spellEnd"/>
+      <w:proofErr w:type="gramEnd"/>
     </w:p>
     <w:p>
       <w:pPr>
         <w:pStyle w:val="TableFootnoteInfo"/>
       </w:pPr>
       <w:r>
-        <w:t>Source file: results/table/eda/cat-cov-sum-study.docx</w:t>
+        <w:t>Source file: results/table/</w:t>
+      </w:r>
+      <w:proofErr w:type="spellStart"/>
+      <w:r>
+        <w:t>eda</w:t>
+      </w:r>
+      <w:proofErr w:type="spellEnd"/>
+      <w:r>
+        <w:t>/cat-cov-sum-study.docx</w:t>
       </w:r>
     </w:p>
     <w:p>
@@ -20151,7 +18072,7 @@
         <w:pStyle w:val="FigureTitle"/>
       </w:pPr>
       <w:bookmarkStart w:id="104" w:name="_Ref224119600"/>
-      <w:bookmarkStart w:id="105" w:name="_Toc224140110"/>
+      <w:bookmarkStart w:id="105" w:name="_Toc225770145"/>
       <w:r>
         <w:lastRenderedPageBreak/>
         <w:t>Figure </w:t>
@@ -20321,7 +18242,7 @@
         <w:pStyle w:val="FigureTitle"/>
       </w:pPr>
       <w:bookmarkStart w:id="106" w:name="_Ref224119690"/>
-      <w:bookmarkStart w:id="107" w:name="_Toc224140112"/>
+      <w:bookmarkStart w:id="107" w:name="_Toc225770146"/>
       <w:r>
         <w:lastRenderedPageBreak/>
         <w:t>Figure </w:t>
@@ -20443,7 +18364,7 @@
         <w:pStyle w:val="FigureTitle"/>
       </w:pPr>
       <w:bookmarkStart w:id="108" w:name="_Ref224120490"/>
-      <w:bookmarkStart w:id="109" w:name="_Toc224140113"/>
+      <w:bookmarkStart w:id="109" w:name="_Toc225770147"/>
       <w:r>
         <w:lastRenderedPageBreak/>
         <w:t>Figure </w:t>
@@ -20614,7 +18535,21 @@
         <w:rPr>
           <w:highlight w:val="cyan"/>
         </w:rPr>
-        <w:t xml:space="preserve"> absorption, followed by a exponential decay over time. The PK appears approximately dose-proportional with no obvious changes with time on treatment</w:t>
+        <w:t xml:space="preserve"> absorption, followed by </w:t>
+      </w:r>
+      <w:proofErr w:type="gramStart"/>
+      <w:r>
+        <w:rPr>
+          <w:highlight w:val="cyan"/>
+        </w:rPr>
+        <w:t>a</w:t>
+      </w:r>
+      <w:proofErr w:type="gramEnd"/>
+      <w:r>
+        <w:rPr>
+          <w:highlight w:val="cyan"/>
+        </w:rPr>
+        <w:t xml:space="preserve"> exponential decay over time. The PK appears approximately dose-proportional with no obvious changes with time on treatment</w:t>
       </w:r>
       <w:r>
         <w:t xml:space="preserve"> (</w:t>
@@ -20861,7 +18796,7 @@
         <w:pStyle w:val="FigureTitle"/>
       </w:pPr>
       <w:bookmarkStart w:id="111" w:name="_Ref224136796"/>
-      <w:bookmarkStart w:id="112" w:name="_Toc224140115"/>
+      <w:bookmarkStart w:id="112" w:name="_Toc225770148"/>
       <w:r>
         <w:lastRenderedPageBreak/>
         <w:t>Figure </w:t>
@@ -21414,7 +19349,29 @@
                   <w:szCs w:val="22"/>
                   <w:u w:val="single"/>
                 </w:rPr>
-                <w:t>General Considerations for Tables, Figures, Listings (TFL) for popPK reports from Clinical Pharmacology &amp; Quantitative Pharmacology CPQP</w:t>
+                <w:t xml:space="preserve">General Considerations for Tables, Figures, Listings (TFL) for </w:t>
+              </w:r>
+              <w:proofErr w:type="spellStart"/>
+              <w:r>
+                <w:rPr>
+                  <w:rStyle w:val="cf01"/>
+                  <w:color w:val="0000FF"/>
+                  <w:sz w:val="22"/>
+                  <w:szCs w:val="22"/>
+                  <w:u w:val="single"/>
+                </w:rPr>
+                <w:t>popPK</w:t>
+              </w:r>
+              <w:proofErr w:type="spellEnd"/>
+              <w:r>
+                <w:rPr>
+                  <w:rStyle w:val="cf01"/>
+                  <w:color w:val="0000FF"/>
+                  <w:sz w:val="22"/>
+                  <w:szCs w:val="22"/>
+                  <w:u w:val="single"/>
+                </w:rPr>
+                <w:t xml:space="preserve"> reports from Clinical Pharmacology &amp; Quantitative Pharmacology CPQP</w:t>
               </w:r>
             </w:hyperlink>
           </w:p>
@@ -21935,8 +19892,15 @@
         <w:pStyle w:val="TableFootnoteInfo"/>
       </w:pPr>
       <w:r>
-        <w:t>Source code: run-log.R</w:t>
-      </w:r>
+        <w:t>Source code: run-</w:t>
+      </w:r>
+      <w:proofErr w:type="spellStart"/>
+      <w:proofErr w:type="gramStart"/>
+      <w:r>
+        <w:t>log.R</w:t>
+      </w:r>
+      <w:proofErr w:type="spellEnd"/>
+      <w:proofErr w:type="gramEnd"/>
     </w:p>
     <w:p>
       <w:pPr>
@@ -24754,7 +22718,20 @@
         <w:pStyle w:val="TableFootnoteInfo"/>
       </w:pPr>
       <w:r>
-        <w:t xml:space="preserve">Source code: eda-tables.R </w:t>
+        <w:t xml:space="preserve">Source code: </w:t>
+      </w:r>
+      <w:proofErr w:type="spellStart"/>
+      <w:r>
+        <w:t>eda-</w:t>
+      </w:r>
+      <w:proofErr w:type="gramStart"/>
+      <w:r>
+        <w:t>tables.R</w:t>
+      </w:r>
+      <w:proofErr w:type="spellEnd"/>
+      <w:proofErr w:type="gramEnd"/>
+      <w:r>
+        <w:t xml:space="preserve"> </w:t>
       </w:r>
     </w:p>
     <w:p>
@@ -24762,7 +22739,15 @@
         <w:pStyle w:val="TableFootnoteInfo"/>
       </w:pPr>
       <w:r>
-        <w:t>Source file: results/table/eda/pk-data-sum-dose-study.docx</w:t>
+        <w:t>Source file: results/table/</w:t>
+      </w:r>
+      <w:proofErr w:type="spellStart"/>
+      <w:r>
+        <w:t>eda</w:t>
+      </w:r>
+      <w:proofErr w:type="spellEnd"/>
+      <w:r>
+        <w:t>/pk-data-sum-dose-study.docx</w:t>
       </w:r>
     </w:p>
     <w:p>
@@ -24806,15 +22791,19 @@
       <w:r>
         <w:t>&lt;&lt;</w:t>
       </w:r>
+      <w:proofErr w:type="spellStart"/>
       <w:r>
         <w:t>gof</w:t>
       </w:r>
+      <w:proofErr w:type="spellEnd"/>
       <w:r>
         <w:t xml:space="preserve"> </w:t>
       </w:r>
+      <w:proofErr w:type="spellStart"/>
       <w:r>
         <w:t>cwres</w:t>
       </w:r>
+      <w:proofErr w:type="spellEnd"/>
       <w:r>
         <w:t xml:space="preserve"> &gt;&gt;</w:t>
       </w:r>
@@ -54392,28 +52381,6 @@
 </file>
 
 <file path=customXml/item2.xml><?xml version="1.0" encoding="utf-8"?>
-<b:Sources xmlns:b="http://schemas.openxmlformats.org/officeDocument/2006/bibliography" xmlns="http://schemas.openxmlformats.org/officeDocument/2006/bibliography" SelectedStyle="\APASixthEditionOfficeOnline.xsl" StyleName="APA" Version="6"/>
-</file>
-
-<file path=customXml/item3.xml><?xml version="1.0" encoding="utf-8"?>
-<p:properties xmlns:p="http://schemas.microsoft.com/office/2006/metadata/properties" xmlns:xsi="http://www.w3.org/2001/XMLSchema-instance" xmlns:pc="http://schemas.microsoft.com/office/infopath/2007/PartnerControls">
-  <documentManagement>
-    <Keyword xmlns="44a56295-c29e-4898-8136-a54736c65b82" xsi:nil="true"/>
-    <Descriptions xmlns="44a56295-c29e-4898-8136-a54736c65b82" xsi:nil="true"/>
-    <lcf76f155ced4ddcb4097134ff3c332f xmlns="8aa277c1-d1ea-4c39-998d-13590e101e7f">
-      <Terms xmlns="http://schemas.microsoft.com/office/infopath/2007/PartnerControls"/>
-    </lcf76f155ced4ddcb4097134ff3c332f>
-    <TaxCatchAll xmlns="a3bda4ac-f0aa-484b-b750-bde5783238e8" xsi:nil="true"/>
-  </documentManagement>
-</p:properties>
-</file>
-
-<file path=customXml/item4.xml><?xml version="1.0" encoding="utf-8"?>
-<?mso-contentType ?>
-<SharedContentType xmlns="Microsoft.SharePoint.Taxonomy.ContentTypeSync" SourceId="1ee89e71-04cd-405e-9ca3-99e020c1694d" ContentTypeId="0x0101" PreviousValue="false"/>
-</file>
-
-<file path=customXml/item5.xml><?xml version="1.0" encoding="utf-8"?>
 <ct:contentTypeSchema xmlns:ct="http://schemas.microsoft.com/office/2006/metadata/contentType" xmlns:ma="http://schemas.microsoft.com/office/2006/metadata/properties/metaAttributes" ct:_="" ma:_="" ma:contentTypeName="Document" ma:contentTypeID="0x010100A7762C85E483334AB8222100ECB11BCE" ma:contentTypeVersion="13" ma:contentTypeDescription="Create a new document." ma:contentTypeScope="" ma:versionID="75b332414a0816cfcde876ee00c40d9c">
   <xsd:schema xmlns:xsd="http://www.w3.org/2001/XMLSchema" xmlns:xs="http://www.w3.org/2001/XMLSchema" xmlns:p="http://schemas.microsoft.com/office/2006/metadata/properties" xmlns:ns2="44a56295-c29e-4898-8136-a54736c65b82" xmlns:ns3="8aa277c1-d1ea-4c39-998d-13590e101e7f" xmlns:ns4="a3bda4ac-f0aa-484b-b750-bde5783238e8" targetNamespace="http://schemas.microsoft.com/office/2006/metadata/properties" ma:root="true" ma:fieldsID="94fde33dd5881b75a2eab763bf6462c7" ns2:_="" ns3:_="" ns4:_="">
     <xsd:import namespace="44a56295-c29e-4898-8136-a54736c65b82"/>
@@ -54629,6 +52596,28 @@
 </ct:contentTypeSchema>
 </file>
 
+<file path=customXml/item3.xml><?xml version="1.0" encoding="utf-8"?>
+<?mso-contentType ?>
+<SharedContentType xmlns="Microsoft.SharePoint.Taxonomy.ContentTypeSync" SourceId="1ee89e71-04cd-405e-9ca3-99e020c1694d" ContentTypeId="0x0101" PreviousValue="false"/>
+</file>
+
+<file path=customXml/item4.xml><?xml version="1.0" encoding="utf-8"?>
+<p:properties xmlns:p="http://schemas.microsoft.com/office/2006/metadata/properties" xmlns:xsi="http://www.w3.org/2001/XMLSchema-instance" xmlns:pc="http://schemas.microsoft.com/office/infopath/2007/PartnerControls">
+  <documentManagement>
+    <Keyword xmlns="44a56295-c29e-4898-8136-a54736c65b82" xsi:nil="true"/>
+    <Descriptions xmlns="44a56295-c29e-4898-8136-a54736c65b82" xsi:nil="true"/>
+    <lcf76f155ced4ddcb4097134ff3c332f xmlns="8aa277c1-d1ea-4c39-998d-13590e101e7f">
+      <Terms xmlns="http://schemas.microsoft.com/office/infopath/2007/PartnerControls"/>
+    </lcf76f155ced4ddcb4097134ff3c332f>
+    <TaxCatchAll xmlns="a3bda4ac-f0aa-484b-b750-bde5783238e8" xsi:nil="true"/>
+  </documentManagement>
+</p:properties>
+</file>
+
+<file path=customXml/item5.xml><?xml version="1.0" encoding="utf-8"?>
+<b:Sources xmlns:b="http://schemas.openxmlformats.org/officeDocument/2006/bibliography" xmlns="http://schemas.openxmlformats.org/officeDocument/2006/bibliography" SelectedStyle="\APASixthEditionOfficeOnline.xsl" StyleName="APA" Version="6"/>
+</file>
+
 <file path=customXml/itemProps1.xml><?xml version="1.0" encoding="utf-8"?>
 <ds:datastoreItem xmlns:ds="http://schemas.openxmlformats.org/officeDocument/2006/customXml" ds:itemID="{6ADEFE45-D4E9-47EC-8556-818C9058A4BE}">
   <ds:schemaRefs>
@@ -54638,34 +52627,6 @@
 </file>
 
 <file path=customXml/itemProps2.xml><?xml version="1.0" encoding="utf-8"?>
-<ds:datastoreItem xmlns:ds="http://schemas.openxmlformats.org/officeDocument/2006/customXml" ds:itemID="{0CB43EF1-53E0-4B1B-AB67-503CDEF86374}">
-  <ds:schemaRefs>
-    <ds:schemaRef ds:uri="http://schemas.openxmlformats.org/officeDocument/2006/bibliography"/>
-  </ds:schemaRefs>
-</ds:datastoreItem>
-</file>
-
-<file path=customXml/itemProps3.xml><?xml version="1.0" encoding="utf-8"?>
-<ds:datastoreItem xmlns:ds="http://schemas.openxmlformats.org/officeDocument/2006/customXml" ds:itemID="{A468AB16-E26C-4EEC-963F-FFAE87E41854}">
-  <ds:schemaRefs>
-    <ds:schemaRef ds:uri="http://schemas.microsoft.com/office/2006/metadata/properties"/>
-    <ds:schemaRef ds:uri="http://schemas.microsoft.com/office/infopath/2007/PartnerControls"/>
-    <ds:schemaRef ds:uri="44a56295-c29e-4898-8136-a54736c65b82"/>
-    <ds:schemaRef ds:uri="8aa277c1-d1ea-4c39-998d-13590e101e7f"/>
-    <ds:schemaRef ds:uri="a3bda4ac-f0aa-484b-b750-bde5783238e8"/>
-  </ds:schemaRefs>
-</ds:datastoreItem>
-</file>
-
-<file path=customXml/itemProps4.xml><?xml version="1.0" encoding="utf-8"?>
-<ds:datastoreItem xmlns:ds="http://schemas.openxmlformats.org/officeDocument/2006/customXml" ds:itemID="{8EF5C56D-9B05-4CE4-B93C-919EF597165D}">
-  <ds:schemaRefs>
-    <ds:schemaRef ds:uri="Microsoft.SharePoint.Taxonomy.ContentTypeSync"/>
-  </ds:schemaRefs>
-</ds:datastoreItem>
-</file>
-
-<file path=customXml/itemProps5.xml><?xml version="1.0" encoding="utf-8"?>
 <ds:datastoreItem xmlns:ds="http://schemas.openxmlformats.org/officeDocument/2006/customXml" ds:itemID="{6859E1BC-91BD-4D67-B1E7-6630A4CB2439}">
   <ds:schemaRefs>
     <ds:schemaRef ds:uri="http://schemas.microsoft.com/office/2006/metadata/contentType"/>
@@ -54683,4 +52644,32 @@
     <ds:schemaRef ds:uri="http://schemas.microsoft.com/internal/obd"/>
   </ds:schemaRefs>
 </ds:datastoreItem>
+</file>
+
+<file path=customXml/itemProps3.xml><?xml version="1.0" encoding="utf-8"?>
+<ds:datastoreItem xmlns:ds="http://schemas.openxmlformats.org/officeDocument/2006/customXml" ds:itemID="{8EF5C56D-9B05-4CE4-B93C-919EF597165D}">
+  <ds:schemaRefs>
+    <ds:schemaRef ds:uri="Microsoft.SharePoint.Taxonomy.ContentTypeSync"/>
+  </ds:schemaRefs>
+</ds:datastoreItem>
+</file>
+
+<file path=customXml/itemProps4.xml><?xml version="1.0" encoding="utf-8"?>
+<ds:datastoreItem xmlns:ds="http://schemas.openxmlformats.org/officeDocument/2006/customXml" ds:itemID="{A468AB16-E26C-4EEC-963F-FFAE87E41854}">
+  <ds:schemaRefs>
+    <ds:schemaRef ds:uri="http://schemas.microsoft.com/office/2006/metadata/properties"/>
+    <ds:schemaRef ds:uri="http://schemas.microsoft.com/office/infopath/2007/PartnerControls"/>
+    <ds:schemaRef ds:uri="44a56295-c29e-4898-8136-a54736c65b82"/>
+    <ds:schemaRef ds:uri="8aa277c1-d1ea-4c39-998d-13590e101e7f"/>
+    <ds:schemaRef ds:uri="a3bda4ac-f0aa-484b-b750-bde5783238e8"/>
+  </ds:schemaRefs>
+</ds:datastoreItem>
+</file>
+
+<file path=customXml/itemProps5.xml><?xml version="1.0" encoding="utf-8"?>
+<ds:datastoreItem xmlns:ds="http://schemas.openxmlformats.org/officeDocument/2006/customXml" ds:itemID="{0CB43EF1-53E0-4B1B-AB67-503CDEF86374}">
+  <ds:schemaRefs>
+    <ds:schemaRef ds:uri="http://schemas.openxmlformats.org/officeDocument/2006/bibliography"/>
+  </ds:schemaRefs>
+</ds:datastoreItem>
 </file>
</xml_diff>

<commit_message>
fix: stabilize yaml/doc sync and block placeholder handling
</commit_message>
<xml_diff>
--- a/PopPK_Report_merge_TFL_filled_draft.docx
+++ b/PopPK_Report_merge_TFL_filled_draft.docx
@@ -5034,23 +5034,7 @@
             <w:lang w:val="en-US"/>
           </w:rPr>
           <w:tab/>
-          <w:t>Summary of Studie</w:t>
-        </w:r>
-        <w:r>
-          <w:rPr>
-            <w:rStyle w:val="Hyperlink"/>
-            <w:noProof/>
-            <w:lang w:val="en-US"/>
-          </w:rPr>
-          <w:t>s</w:t>
-        </w:r>
-        <w:r>
-          <w:rPr>
-            <w:rStyle w:val="Hyperlink"/>
-            <w:noProof/>
-            <w:lang w:val="en-US"/>
-          </w:rPr>
-          <w:t xml:space="preserve"> Included in the Population PK Analysis</w:t>
+          <w:t>Summary of Studies Included in the Population PK Analysis</w:t>
         </w:r>
         <w:r>
           <w:rPr>
@@ -5174,98 +5158,72 @@
           <w14:ligatures w14:val="standardContextual"/>
         </w:rPr>
       </w:pPr>
-      <w:r>
-        <w:fldChar w:fldCharType="begin"/>
-      </w:r>
-      <w:r>
-        <w:instrText>HYPERLINK \l "_Toc224140105"</w:instrText>
-      </w:r>
-      <w:r>
-        <w:fldChar w:fldCharType="separate"/>
-      </w:r>
-      <w:r>
-        <w:rPr>
-          <w:rStyle w:val="Hyperlink"/>
-          <w:noProof/>
-        </w:rPr>
-        <w:t>Table 3</w:t>
-      </w:r>
-      <w:r>
-        <w:rPr>
-          <w:rStyle w:val="Hyperlink"/>
-          <w:noProof/>
-        </w:rPr>
-        <w:tab/>
-        <w:t xml:space="preserve">Summary of Covariates Overall and by </w:t>
-      </w:r>
-      <w:r>
-        <w:rPr>
-          <w:rStyle w:val="Hyperlink"/>
-          <w:noProof/>
-          <w:highlight w:val="cyan"/>
-        </w:rPr>
-        <w:t>{{S</w:t>
-      </w:r>
-      <w:r>
-        <w:rPr>
-          <w:rStyle w:val="Hyperlink"/>
-          <w:noProof/>
-          <w:highlight w:val="cyan"/>
-        </w:rPr>
-        <w:t>}</w:t>
-      </w:r>
-      <w:r>
-        <w:rPr>
-          <w:rStyle w:val="Hyperlink"/>
-          <w:noProof/>
-          <w:highlight w:val="cyan"/>
-        </w:rPr>
-        <w:t>}</w:t>
-      </w:r>
-      <w:r>
-        <w:rPr>
-          <w:noProof/>
-        </w:rPr>
-        <w:tab/>
-      </w:r>
-      <w:r>
-        <w:rPr>
-          <w:noProof/>
-        </w:rPr>
-        <w:fldChar w:fldCharType="begin"/>
-      </w:r>
-      <w:r>
-        <w:rPr>
-          <w:noProof/>
-        </w:rPr>
-        <w:instrText xml:space="preserve"> PAGEREF _Toc224140105 \h </w:instrText>
-      </w:r>
-      <w:r>
-        <w:rPr>
-          <w:noProof/>
-        </w:rPr>
-      </w:r>
-      <w:r>
-        <w:rPr>
-          <w:noProof/>
-        </w:rPr>
-        <w:fldChar w:fldCharType="separate"/>
-      </w:r>
-      <w:r>
-        <w:rPr>
-          <w:noProof/>
-        </w:rPr>
-        <w:t>20</w:t>
-      </w:r>
-      <w:r>
-        <w:rPr>
-          <w:noProof/>
-        </w:rPr>
-        <w:fldChar w:fldCharType="end"/>
-      </w:r>
-      <w:r>
-        <w:fldChar w:fldCharType="end"/>
-      </w:r>
+      <w:hyperlink w:anchor="_Toc224140105" w:history="1">
+        <w:r>
+          <w:rPr>
+            <w:rStyle w:val="Hyperlink"/>
+            <w:noProof/>
+          </w:rPr>
+          <w:t>Table 3</w:t>
+        </w:r>
+        <w:r>
+          <w:rPr>
+            <w:rStyle w:val="Hyperlink"/>
+            <w:noProof/>
+          </w:rPr>
+          <w:tab/>
+          <w:t xml:space="preserve">Summary of Covariates Overall and by </w:t>
+        </w:r>
+        <w:r>
+          <w:rPr>
+            <w:rStyle w:val="Hyperlink"/>
+            <w:noProof/>
+            <w:highlight w:val="cyan"/>
+          </w:rPr>
+          <w:t>{{S}}</w:t>
+        </w:r>
+        <w:r>
+          <w:rPr>
+            <w:noProof/>
+          </w:rPr>
+          <w:tab/>
+        </w:r>
+        <w:r>
+          <w:rPr>
+            <w:noProof/>
+          </w:rPr>
+          <w:fldChar w:fldCharType="begin"/>
+        </w:r>
+        <w:r>
+          <w:rPr>
+            <w:noProof/>
+          </w:rPr>
+          <w:instrText xml:space="preserve"> PAGEREF _Toc224140105 \h </w:instrText>
+        </w:r>
+        <w:r>
+          <w:rPr>
+            <w:noProof/>
+          </w:rPr>
+        </w:r>
+        <w:r>
+          <w:rPr>
+            <w:noProof/>
+          </w:rPr>
+          <w:fldChar w:fldCharType="separate"/>
+        </w:r>
+        <w:r>
+          <w:rPr>
+            <w:noProof/>
+          </w:rPr>
+          <w:t>20</w:t>
+        </w:r>
+        <w:r>
+          <w:rPr>
+            <w:noProof/>
+          </w:rPr>
+          <w:fldChar w:fldCharType="end"/>
+        </w:r>
+      </w:hyperlink>
     </w:p>
     <w:p>
       <w:pPr>
@@ -22775,6 +22733,27 @@
       <w:r>
         <w:t>etails</w:t>
       </w:r>
+    </w:p>
+    <w:p>
+      <w:pPr>
+        <w:spacing w:after="160" w:line="259" w:lineRule="auto"/>
+        <w:rPr>
+          <w:rFonts w:asciiTheme="majorHAnsi" w:hAnsiTheme="majorHAnsi" w:cs="Arial"/>
+          <w:b/>
+          <w:iCs/>
+          <w:snapToGrid w:val="0"/>
+          <w:sz w:val="28"/>
+          <w:szCs w:val="26"/>
+        </w:rPr>
+      </w:pPr>
+      <w:r>
+        <w:t>&lt;&lt;block:testing&gt;&gt;</w:t>
+      </w:r>
+    </w:p>
+    <w:p>
+      <w:pPr>
+        <w:pStyle w:val="AppendixAlpha"/>
+      </w:pPr>
     </w:p>
     <w:p>
       <w:pPr>
@@ -52381,6 +52360,28 @@
 </file>
 
 <file path=customXml/item2.xml><?xml version="1.0" encoding="utf-8"?>
+<b:Sources xmlns:b="http://schemas.openxmlformats.org/officeDocument/2006/bibliography" xmlns="http://schemas.openxmlformats.org/officeDocument/2006/bibliography" SelectedStyle="\APASixthEditionOfficeOnline.xsl" StyleName="APA" Version="6"/>
+</file>
+
+<file path=customXml/item3.xml><?xml version="1.0" encoding="utf-8"?>
+<p:properties xmlns:p="http://schemas.microsoft.com/office/2006/metadata/properties" xmlns:xsi="http://www.w3.org/2001/XMLSchema-instance" xmlns:pc="http://schemas.microsoft.com/office/infopath/2007/PartnerControls">
+  <documentManagement>
+    <Keyword xmlns="44a56295-c29e-4898-8136-a54736c65b82" xsi:nil="true"/>
+    <Descriptions xmlns="44a56295-c29e-4898-8136-a54736c65b82" xsi:nil="true"/>
+    <lcf76f155ced4ddcb4097134ff3c332f xmlns="8aa277c1-d1ea-4c39-998d-13590e101e7f">
+      <Terms xmlns="http://schemas.microsoft.com/office/infopath/2007/PartnerControls"/>
+    </lcf76f155ced4ddcb4097134ff3c332f>
+    <TaxCatchAll xmlns="a3bda4ac-f0aa-484b-b750-bde5783238e8" xsi:nil="true"/>
+  </documentManagement>
+</p:properties>
+</file>
+
+<file path=customXml/item4.xml><?xml version="1.0" encoding="utf-8"?>
+<?mso-contentType ?>
+<SharedContentType xmlns="Microsoft.SharePoint.Taxonomy.ContentTypeSync" SourceId="1ee89e71-04cd-405e-9ca3-99e020c1694d" ContentTypeId="0x0101" PreviousValue="false"/>
+</file>
+
+<file path=customXml/item5.xml><?xml version="1.0" encoding="utf-8"?>
 <ct:contentTypeSchema xmlns:ct="http://schemas.microsoft.com/office/2006/metadata/contentType" xmlns:ma="http://schemas.microsoft.com/office/2006/metadata/properties/metaAttributes" ct:_="" ma:_="" ma:contentTypeName="Document" ma:contentTypeID="0x010100A7762C85E483334AB8222100ECB11BCE" ma:contentTypeVersion="13" ma:contentTypeDescription="Create a new document." ma:contentTypeScope="" ma:versionID="75b332414a0816cfcde876ee00c40d9c">
   <xsd:schema xmlns:xsd="http://www.w3.org/2001/XMLSchema" xmlns:xs="http://www.w3.org/2001/XMLSchema" xmlns:p="http://schemas.microsoft.com/office/2006/metadata/properties" xmlns:ns2="44a56295-c29e-4898-8136-a54736c65b82" xmlns:ns3="8aa277c1-d1ea-4c39-998d-13590e101e7f" xmlns:ns4="a3bda4ac-f0aa-484b-b750-bde5783238e8" targetNamespace="http://schemas.microsoft.com/office/2006/metadata/properties" ma:root="true" ma:fieldsID="94fde33dd5881b75a2eab763bf6462c7" ns2:_="" ns3:_="" ns4:_="">
     <xsd:import namespace="44a56295-c29e-4898-8136-a54736c65b82"/>
@@ -52596,28 +52597,6 @@
 </ct:contentTypeSchema>
 </file>
 
-<file path=customXml/item3.xml><?xml version="1.0" encoding="utf-8"?>
-<?mso-contentType ?>
-<SharedContentType xmlns="Microsoft.SharePoint.Taxonomy.ContentTypeSync" SourceId="1ee89e71-04cd-405e-9ca3-99e020c1694d" ContentTypeId="0x0101" PreviousValue="false"/>
-</file>
-
-<file path=customXml/item4.xml><?xml version="1.0" encoding="utf-8"?>
-<p:properties xmlns:p="http://schemas.microsoft.com/office/2006/metadata/properties" xmlns:xsi="http://www.w3.org/2001/XMLSchema-instance" xmlns:pc="http://schemas.microsoft.com/office/infopath/2007/PartnerControls">
-  <documentManagement>
-    <Keyword xmlns="44a56295-c29e-4898-8136-a54736c65b82" xsi:nil="true"/>
-    <Descriptions xmlns="44a56295-c29e-4898-8136-a54736c65b82" xsi:nil="true"/>
-    <lcf76f155ced4ddcb4097134ff3c332f xmlns="8aa277c1-d1ea-4c39-998d-13590e101e7f">
-      <Terms xmlns="http://schemas.microsoft.com/office/infopath/2007/PartnerControls"/>
-    </lcf76f155ced4ddcb4097134ff3c332f>
-    <TaxCatchAll xmlns="a3bda4ac-f0aa-484b-b750-bde5783238e8" xsi:nil="true"/>
-  </documentManagement>
-</p:properties>
-</file>
-
-<file path=customXml/item5.xml><?xml version="1.0" encoding="utf-8"?>
-<b:Sources xmlns:b="http://schemas.openxmlformats.org/officeDocument/2006/bibliography" xmlns="http://schemas.openxmlformats.org/officeDocument/2006/bibliography" SelectedStyle="\APASixthEditionOfficeOnline.xsl" StyleName="APA" Version="6"/>
-</file>
-
 <file path=customXml/itemProps1.xml><?xml version="1.0" encoding="utf-8"?>
 <ds:datastoreItem xmlns:ds="http://schemas.openxmlformats.org/officeDocument/2006/customXml" ds:itemID="{6ADEFE45-D4E9-47EC-8556-818C9058A4BE}">
   <ds:schemaRefs>
@@ -52627,6 +52606,34 @@
 </file>
 
 <file path=customXml/itemProps2.xml><?xml version="1.0" encoding="utf-8"?>
+<ds:datastoreItem xmlns:ds="http://schemas.openxmlformats.org/officeDocument/2006/customXml" ds:itemID="{0CB43EF1-53E0-4B1B-AB67-503CDEF86374}">
+  <ds:schemaRefs>
+    <ds:schemaRef ds:uri="http://schemas.openxmlformats.org/officeDocument/2006/bibliography"/>
+  </ds:schemaRefs>
+</ds:datastoreItem>
+</file>
+
+<file path=customXml/itemProps3.xml><?xml version="1.0" encoding="utf-8"?>
+<ds:datastoreItem xmlns:ds="http://schemas.openxmlformats.org/officeDocument/2006/customXml" ds:itemID="{A468AB16-E26C-4EEC-963F-FFAE87E41854}">
+  <ds:schemaRefs>
+    <ds:schemaRef ds:uri="http://schemas.microsoft.com/office/2006/metadata/properties"/>
+    <ds:schemaRef ds:uri="http://schemas.microsoft.com/office/infopath/2007/PartnerControls"/>
+    <ds:schemaRef ds:uri="44a56295-c29e-4898-8136-a54736c65b82"/>
+    <ds:schemaRef ds:uri="8aa277c1-d1ea-4c39-998d-13590e101e7f"/>
+    <ds:schemaRef ds:uri="a3bda4ac-f0aa-484b-b750-bde5783238e8"/>
+  </ds:schemaRefs>
+</ds:datastoreItem>
+</file>
+
+<file path=customXml/itemProps4.xml><?xml version="1.0" encoding="utf-8"?>
+<ds:datastoreItem xmlns:ds="http://schemas.openxmlformats.org/officeDocument/2006/customXml" ds:itemID="{8EF5C56D-9B05-4CE4-B93C-919EF597165D}">
+  <ds:schemaRefs>
+    <ds:schemaRef ds:uri="Microsoft.SharePoint.Taxonomy.ContentTypeSync"/>
+  </ds:schemaRefs>
+</ds:datastoreItem>
+</file>
+
+<file path=customXml/itemProps5.xml><?xml version="1.0" encoding="utf-8"?>
 <ds:datastoreItem xmlns:ds="http://schemas.openxmlformats.org/officeDocument/2006/customXml" ds:itemID="{6859E1BC-91BD-4D67-B1E7-6630A4CB2439}">
   <ds:schemaRefs>
     <ds:schemaRef ds:uri="http://schemas.microsoft.com/office/2006/metadata/contentType"/>
@@ -52644,32 +52651,4 @@
     <ds:schemaRef ds:uri="http://schemas.microsoft.com/internal/obd"/>
   </ds:schemaRefs>
 </ds:datastoreItem>
-</file>
-
-<file path=customXml/itemProps3.xml><?xml version="1.0" encoding="utf-8"?>
-<ds:datastoreItem xmlns:ds="http://schemas.openxmlformats.org/officeDocument/2006/customXml" ds:itemID="{8EF5C56D-9B05-4CE4-B93C-919EF597165D}">
-  <ds:schemaRefs>
-    <ds:schemaRef ds:uri="Microsoft.SharePoint.Taxonomy.ContentTypeSync"/>
-  </ds:schemaRefs>
-</ds:datastoreItem>
-</file>
-
-<file path=customXml/itemProps4.xml><?xml version="1.0" encoding="utf-8"?>
-<ds:datastoreItem xmlns:ds="http://schemas.openxmlformats.org/officeDocument/2006/customXml" ds:itemID="{A468AB16-E26C-4EEC-963F-FFAE87E41854}">
-  <ds:schemaRefs>
-    <ds:schemaRef ds:uri="http://schemas.microsoft.com/office/2006/metadata/properties"/>
-    <ds:schemaRef ds:uri="http://schemas.microsoft.com/office/infopath/2007/PartnerControls"/>
-    <ds:schemaRef ds:uri="44a56295-c29e-4898-8136-a54736c65b82"/>
-    <ds:schemaRef ds:uri="8aa277c1-d1ea-4c39-998d-13590e101e7f"/>
-    <ds:schemaRef ds:uri="a3bda4ac-f0aa-484b-b750-bde5783238e8"/>
-  </ds:schemaRefs>
-</ds:datastoreItem>
-</file>
-
-<file path=customXml/itemProps5.xml><?xml version="1.0" encoding="utf-8"?>
-<ds:datastoreItem xmlns:ds="http://schemas.openxmlformats.org/officeDocument/2006/customXml" ds:itemID="{0CB43EF1-53E0-4B1B-AB67-503CDEF86374}">
-  <ds:schemaRefs>
-    <ds:schemaRef ds:uri="http://schemas.openxmlformats.org/officeDocument/2006/bibliography"/>
-  </ds:schemaRefs>
-</ds:datastoreItem>
 </file>
</xml_diff>